<commit_message>
Strengthen Chapter 3 policy recommendations and geographic comparisons
</commit_message>
<xml_diff>
--- a/research/02_chip_trade/documents/chapter3.docx
+++ b/research/02_chip_trade/documents/chapter3.docx
@@ -757,7 +757,12 @@
     </w:p>
     <w:p>
       <w:r>
-        <w:t>Рекомендации образуют последовательность из трех взаимосвязанных решений. Сначала устанавливается, какие дополнительные товары компания способна предложить с приемлемыми затратами. Затем проверяется наличие покупателей и отличие их спроса от существующих источников выручки. Наконец, определяется порядок расширения поставок и наблюдения за результатами. Сценарный расчет в параграфе 3.4 позволяет оценить масштаб возможного изменения исторического индекса при заданных товарных сдвигах. В сочетании с коммерческой проверкой он служит инструментом обсуждения проектов, сохраняя различие между статистическим свойством структуры и результатом конкретной меры.</w:t>
+        <w:t>Связь между национальной статистикой и отдельным проектом требует дополнительного обоснования. Разложение главы 2 определяет направление поиска: для Кореи — расширение поставок за пределами памяти, для Японии — проверка отдельных возможностей без единой целевой пропорции. Выбор способа поддержки опирается на отраслевые ограничения разработки и коммерциализации, а решение о финансировании — на сведения о проекте. Эти основания дополняют друг друга; национальная оценка волатильности не заменяет проверку конкретного изделия.</w:t>
+      </w:r>
+    </w:p>
+    <w:p>
+      <w:r>
+        <w:t>Рекомендации образуют последовательность взаимосвязанных решений. Сначала устанавливается, какие дополнительные товары компания способна предложить с приемлемыми затратами. Затем проверяется наличие покупателей и отличие их спроса от существующих источников выручки. Наконец, определяется порядок расширения поставок и наблюдения за результатами. Сценарный расчет в параграфе 3.4 позволяет оценить масштаб возможного изменения исторического индекса при заданных товарных сдвигах. Географическое сопоставление в параграфе 3.3 дополнительно показывает, какого расширения отдельных направлений потребует одинаковая прибавка экспорта. Вместе эти расчеты задают проверяемые условия обсуждения проектов.</w:t>
       </w:r>
     </w:p>
     <w:p>
@@ -790,7 +795,7 @@
     </w:p>
     <w:p>
       <w:r>
-        <w:t>Институциональный пример такого подхода содержится в объявлении корейского Министерства малого и среднего бизнеса и стартапов от 12 февраля 2025 года. Программа Fabless Startup Comprehensive Support Project разделяла поддержку по стадиям развития. В сообщении предусматривались доступ к готовым проектным блокам (IP) и средствам автоматизации проектирования (EDA) на раннем этапе, помощь с MPW и взаимодействием с заказчиками на стадии роста, а также проверка продукции с использованием инфраструктуры крупных компаний перед масштабированием. Этот пример подтверждает наличие соответствующих инструментов в практике поддержки. Объявление программы не содержит оценки ее влияния на экспорт и не используется здесь как доказательство эффективности.</w:t>
+        <w:t>Институциональный пример такого подхода содержится в объявлении корейского Министерства малого и среднего бизнеса и стартапов от 12 февраля 2025 года. Программа Fabless Startup Comprehensive Support Project разделяла поддержку по стадиям развития. В сообщении предусматривались доступ к готовым проектным блокам (IP) и средствам автоматизации проектирования (EDA) на раннем этапе, помощь с MPW и взаимодействием с заказчиками на стадии роста, а также проверка продукции с использованием инфраструктуры крупных компаний перед масштабированием. Это описание показывает, что стадийная поддержка уже входит в объявленную политику.</w:t>
       </w:r>
       <w:r>
         <w:rPr>
@@ -807,7 +812,7 @@
     </w:p>
     <w:p>
       <w:r>
-        <w:t>Пример сотрудничества участников разных стадий представлен в сообщении корейского промышленного ведомства от 30 сентября 2025 года о проекте K-On-Device AI Semiconductor Technology Development. В нем предусматривались консорциумы заказчиков, разработчиков и производственных партнеров; запуск планировался на 2026 год. В настоящей работе используется сам принцип совместного определения требований и проверки изделия. Планы выпуска прототипов и последующих разработок из этого сообщения не трактуются как уже достигнутые результаты.</w:t>
+        <w:t>Пример сотрудничества участников разных стадий представлен в сообщении корейского промышленного ведомства от 30 сентября 2025 года о проекте K-On-Device AI Semiconductor Technology Development. В нем предусматривались консорциумы заказчиков, разработчиков и производственных партнеров; запуск планировался на 2026 год. Сообщение задает план сотрудничества и технологические этапы; приведенные в нем будущие результаты относятся к планам на момент объявления.</w:t>
       </w:r>
       <w:r>
         <w:rPr>
@@ -816,6 +821,16 @@
         <w:footnoteReference w:id="3"/>
       </w:r>
       <w:r/>
+    </w:p>
+    <w:p>
+      <w:r>
+        <w:t>Из сопоставления этих программ с результатами исследования следует более узкая задача дополнения существующих мер. Для оценки экспортной диверсификации к техническим этапам предлагается добавить сведения о товарной категории, территории будущей отгрузки, группе покупателя и зависимости его заказов от уже обслуживаемых рынков. В рассмотренных сообщениях акцент сделан на разработке, проверке и коммерциализации; критерий совместной динамики экспортных поступлений подробно не раскрыт. Это граница опубликованного описания, а не доказательство отсутствия такого анализа у операторов программ.</w:t>
+      </w:r>
+    </w:p>
+    <w:p>
+      <w:r>
+        <w:t>Для корейского проекта развития продукции вне памяти предлагается включать в решение о расширении два результата: подтвержденную экономику серии и оценку того, какой источник спроса добавляет заказчик. Если первый покупатель обеспечивает окупаемость, отсутствие второго не должно автоматически закрывать проект. В этом случае зависимость отражается в оценке риска, а при последующей поддержке проверяется возможность второго применения. Если же новый покупатель связан с прежним той же корпоративной группой или конечной продуктовой линейкой, прирост числа контрактов не засчитывается как самостоятельное расширение источников спроса.</w:t>
+      </w:r>
     </w:p>
     <w:p>
       <w:r>
@@ -841,12 +856,17 @@
     </w:p>
     <w:p>
       <w:r>
+        <w:t>Применительно к Японии из этого следует предложение дополнить отбор технологических проектов проверкой их вклада именно в поставки исследуемых товаров. Для каждого кандидата сопоставляются стоимость доведения изделия до серии, подтвержденный покупатель и территория производства и отгрузки. Это позволяет различать укрепление инженерных компетенций, рост выручки международной группы и увеличение экспорта с территории Японии. Все три результата могут иметь экономическую ценность, однако оценивать их по одному показателю экспортной доли некорректно.</w:t>
+      </w:r>
+    </w:p>
+    <w:p>
+      <w:r>
         <w:t>Ограничение товарного охвата необходимо сохранить и при обсуждении новых технологий. Название области применения — например, автомобильная электроника — не определяет таможенную категорию каждого изделия. В ней могут использоваться как интегральные схемы, так и продукция вне позиции HS8542. Для проекта, включенного в программу диверсификации исследуемого экспорта, требуется установить конкретный вид поставляемого товара. Иначе рост продаж оборудования или иных компонентов будет ошибочно представлен как результат изменения структуры интегральных схем.</w:t>
       </w:r>
     </w:p>
     <w:p>
       <w:r>
-        <w:t>Еще одно ограничение связано с переносом выпуска между технологическими направлениями. В работе ОЭСР The Chip Landscape показано, что производственные мощности различаются по типам процессов и возможностям изготовления продукции; их взаимозаменяемость ограничена. Поэтому предполагаемое увеличение выпуска одной группы нельзя оценивать только по наличию незагруженной мощности в другой. До расширения проекта необходимы проверка доступного технологического процесса, оценка выхода годных изделий и согласование условий производства. Основные предлагаемые меры представлены в таблице 3.2.</w:t>
+        <w:t>Еще одно ограничение связано с переносом выпуска между технологическими направлениями. В работе ОЭСР The Chip Landscape показано, что производственные мощности различаются по типам процессов и возможностям изготовления продукции; их взаимозаменяемость ограничена. Поэтому предполагаемое увеличение выпуска одной группы нельзя оценивать только по наличию незагруженной мощности в другой. До расширения проекта необходимы проверка доступного технологического процесса, оценка выхода годных изделий и согласование условий производства.</w:t>
       </w:r>
       <w:r>
         <w:rPr>
@@ -854,7 +874,9 @@
         </w:rPr>
         <w:footnoteReference w:id="5"/>
       </w:r>
-      <w:r/>
+      <w:r>
+        <w:t xml:space="preserve"> Сопоставление существующих мер с предлагаемыми дополнениями приведено в таблице 3.2.</w:t>
+      </w:r>
     </w:p>
     <w:p>
       <w:pPr>
@@ -870,7 +892,7 @@
           <w:color w:val="000000"/>
           <w:sz w:val="22"/>
         </w:rPr>
-        <w:t>Таблица 3.2 — Меры по развитию дополнительных продуктовых направлений</w:t>
+        <w:t>Таблица 3.2 — Дополнение существующих инструментов критериями экспортной диверсификации</w:t>
       </w:r>
     </w:p>
     <w:tbl>
@@ -926,7 +948,7 @@
                 <w:color w:val="000000"/>
                 <w:sz w:val="21"/>
               </w:rPr>
-              <w:t>Ограничение</w:t>
+              <w:t>Инструмент из источника</w:t>
             </w:r>
           </w:p>
         </w:tc>
@@ -957,7 +979,7 @@
                 <w:color w:val="000000"/>
                 <w:sz w:val="21"/>
               </w:rPr>
-              <w:t>Предлагаемая мера</w:t>
+              <w:t>Задача для экспортной оценки</w:t>
             </w:r>
           </w:p>
         </w:tc>
@@ -988,7 +1010,7 @@
                 <w:color w:val="000000"/>
                 <w:sz w:val="21"/>
               </w:rPr>
-              <w:t>Ответственные участники</w:t>
+              <w:t>Предлагаемое дополнение</w:t>
             </w:r>
           </w:p>
         </w:tc>
@@ -1019,7 +1041,7 @@
                 <w:color w:val="000000"/>
                 <w:sz w:val="21"/>
               </w:rPr>
-              <w:t>Результат этапа</w:t>
+              <w:t>Проверяемый результат</w:t>
             </w:r>
           </w:p>
         </w:tc>
@@ -1054,7 +1076,7 @@
                 <w:color w:val="000000"/>
                 <w:sz w:val="21"/>
               </w:rPr>
-              <w:t>Нет проверенного применения</w:t>
+              <w:t>Корея: стадийная поддержка fabless-компаний, MSS</w:t>
             </w:r>
           </w:p>
         </w:tc>
@@ -1084,7 +1106,7 @@
                 <w:color w:val="000000"/>
                 <w:sz w:val="21"/>
               </w:rPr>
-              <w:t>Совместное техническое задание и испытания у заказчика</w:t>
+              <w:t>Технический прогресс еще не определяет состав будущей выручки</w:t>
             </w:r>
           </w:p>
         </w:tc>
@@ -1114,7 +1136,7 @@
                 <w:color w:val="000000"/>
                 <w:sz w:val="21"/>
               </w:rPr>
-              <w:t>Разработчик и потенциальный покупатель</w:t>
+              <w:t>Учет товара, территории отгрузки и группы покупателя при переходе к серии</w:t>
             </w:r>
           </w:p>
         </w:tc>
@@ -1144,7 +1166,7 @@
                 <w:color w:val="000000"/>
                 <w:sz w:val="21"/>
               </w:rPr>
-              <w:t>Подтверждение требуемых характеристик</w:t>
+              <w:t>Оплаченные поставки и раскрытая зависимость от заказчика</w:t>
             </w:r>
           </w:p>
         </w:tc>
@@ -1179,7 +1201,7 @@
                 <w:color w:val="000000"/>
                 <w:sz w:val="21"/>
               </w:rPr>
-              <w:t>Высоки первоначальные расходы</w:t>
+              <w:t>Корея: консорциумы заказчиков и разработчиков, MOTIE</w:t>
             </w:r>
           </w:p>
         </w:tc>
@@ -1209,7 +1231,7 @@
                 <w:color w:val="000000"/>
                 <w:sz w:val="21"/>
               </w:rPr>
-              <w:t>Доступ к проектным средствам и совместным опытным партиям</w:t>
+              <w:t>Первое применение может сохранить зависимость от одной цепочки спроса</w:t>
             </w:r>
           </w:p>
         </w:tc>
@@ -1239,7 +1261,7 @@
                 <w:color w:val="000000"/>
                 <w:sz w:val="21"/>
               </w:rPr>
-              <w:t>Разработчик, оператор инфраструктуры, производственный партнер</w:t>
+              <w:t>Проверка второго применения при расширении поддержки либо явный учет зависимости</w:t>
             </w:r>
           </w:p>
         </w:tc>
@@ -1269,7 +1291,7 @@
                 <w:color w:val="000000"/>
                 <w:sz w:val="21"/>
               </w:rPr>
-              <w:t>Работоспособный образец и смета доработки</w:t>
+              <w:t>Повторный заказ; подтвержденное независимое применение, если оно доступно</w:t>
             </w:r>
           </w:p>
         </w:tc>
@@ -1304,7 +1326,7 @@
                 <w:color w:val="000000"/>
                 <w:sz w:val="21"/>
               </w:rPr>
-              <w:t>Неясен переход к серии</w:t>
+              <w:t>Япония: несколько технологических направлений, METI</w:t>
             </w:r>
           </w:p>
         </w:tc>
@@ -1334,7 +1356,7 @@
                 <w:color w:val="000000"/>
                 <w:sz w:val="21"/>
               </w:rPr>
-              <w:t>Ограниченная пилотная партия с заранее заданными критериями</w:t>
+              <w:t>Развитие группы компаний не тождественно росту экспорта Японии</w:t>
             </w:r>
           </w:p>
         </w:tc>
@@ -1364,7 +1386,7 @@
                 <w:color w:val="000000"/>
                 <w:sz w:val="21"/>
               </w:rPr>
-              <w:t>Производитель и служба качества заказчика</w:t>
+              <w:t>Раздельная оценка компетенций, коммерческого результата и территории поставок</w:t>
             </w:r>
           </w:p>
         </w:tc>
@@ -1394,7 +1416,319 @@
                 <w:color w:val="000000"/>
                 <w:sz w:val="21"/>
               </w:rPr>
-              <w:t>Квалификация изделия и расчет себестоимости</w:t>
+              <w:t>Проверенная экономика изделия и установленный вклад в экспорт</w:t>
+            </w:r>
+          </w:p>
+        </w:tc>
+      </w:tr>
+    </w:tbl>
+    <w:p>
+      <w:pPr>
+        <w:keepNext/>
+        <w:spacing w:line="240" w:lineRule="auto" w:before="60" w:after="80"/>
+        <w:ind w:firstLine="0"/>
+      </w:pPr>
+      <w:r>
+        <w:rPr>
+          <w:rFonts w:ascii="Times New Roman" w:hAnsi="Times New Roman"/>
+          <w:b w:val="0"/>
+          <w:color w:val="000000"/>
+          <w:sz w:val="20"/>
+        </w:rPr>
+        <w:t>Примечание: таблица сопоставляет опубликованные описания мер с задачами настоящего исследования; она не является аудитом всех правил соответствующих программ.</w:t>
+      </w:r>
+    </w:p>
+    <w:p>
+      <w:pPr>
+        <w:keepNext w:val="0"/>
+        <w:spacing w:line="240" w:lineRule="auto" w:before="60" w:after="80"/>
+        <w:ind w:firstLine="0"/>
+      </w:pPr>
+      <w:r>
+        <w:rPr>
+          <w:rFonts w:ascii="Times New Roman" w:hAnsi="Times New Roman"/>
+          <w:b w:val="0"/>
+          <w:color w:val="000000"/>
+          <w:sz w:val="20"/>
+        </w:rPr>
+        <w:t>Источник: предложения автора на основе MSS (2025), MOTIE (2025), METI (2024).</w:t>
+      </w:r>
+    </w:p>
+    <w:p>
+      <w:r>
+        <w:t>Связь между разработкой и устойчивыми поставками конкретизирует пример японской Socionext. В годовом отчете за финансовый год, завершившийся 31 марта 2025 года, компания указывает, что разработка и оценка продукта заказчиком могут занимать два года и более. Платежи за проектирование и разработку — NRE — обычно покрывают большую часть соответствующих расходов, но при прекращении проекта возможны неполучение оставшихся платежей и убытки. После завершения разработки объем серийных закупок определяется отдельными заказами и может отличаться от первоначальных ожиданий.</w:t>
+      </w:r>
+      <w:r>
+        <w:rPr>
+          <w:rStyle w:val="FootnoteReference"/>
+        </w:rPr>
+        <w:footnoteReference w:id="6"/>
+      </w:r>
+      <w:r/>
+    </w:p>
+    <w:p>
+      <w:r>
+        <w:t>Этот пример позволяет уточнить предлагаемые условия поддержки. Договор на разработку подтверждает заинтересованность заказчика и частичное разделение затрат. Квалификация изделия подтверждает его пригодность к согласованному применению. Для решения о масштабировании дополнительно нужны фактические заказы, ожидаемая маржа и условия оплаты. Следовательно, финансирование следующей стадии целесообразно связывать с новым подтверждением спроса, а расходы прекращенных проектов включать в оценку всей программы. Пример показывает механизм коммерческого риска; эффект поддержки на национальный экспорт по отчетности одной компании не оценивается.</w:t>
+      </w:r>
+    </w:p>
+    <w:p>
+      <w:r>
+        <w:t>Для каждой меры необходим отдельный расчет ресурсов. На стадии разработки учитываются труд инженеров, лицензии и используемые проектные блоки; при изготовлении образца — производственные услуги, маски, испытания и возможная повторная итерация. Перед серийным выпуском добавляются расходы на квалификацию, обеспечение качества, оборотный капитал и обслуживание покупателей. Часть затрат может быть общей для нескольких проектов. Их распределение должно отражать фактическое использование инфраструктуры, чтобы общие расходы не скрывались за формально низкой стоимостью отдельной разработки.</w:t>
+      </w:r>
+    </w:p>
+    <w:p>
+      <w:r>
+        <w:t>Состав затрат позволяет определить основания для продолжения проекта. Если образец соответствует заданию, но покупатель не подтверждает потребность, требуется пересмотр коммерческой части. Если спрос подтвержден, но себестоимость превышает допустимый уровень, необходимо изменить конструкцию, условия производства или масштаб. При отсутствии реалистичного пути к приемлемой экономике дальнейшее финансирование не оправдывается одним лишь желанием расширить ассортимент. При государственной поддержке результаты разработки и результаты продаж следует учитывать раздельно.</w:t>
+      </w:r>
+    </w:p>
+    <w:p>
+      <w:r>
+        <w:t>Предлагаемые товарные меры имеют общий принцип для обеих стран — развитие дополнительных возможностей получения выручки. Различается основание их приоритетности. В Корее эмпирические результаты поддерживают более пристальное внимание к росту поставок за пределами памяти. В Японии приоритет должен определяться качеством конкретных проектов и их связью с существующими компетенциями. В обоих случаях устойчивость оценивается после проверки спроса и затрат; принадлежность изделия к менее крупной товарной группе сама по себе не служит достаточным преимуществом.</w:t>
+      </w:r>
+    </w:p>
+    <w:p>
+      <w:pPr>
+        <w:pStyle w:val="Heading1"/>
+      </w:pPr>
+      <w:r>
+        <w:t>3.3 Совершенствование географической структуры экспортных поставок</w:t>
+      </w:r>
+    </w:p>
+    <w:p>
+      <w:r>
+        <w:t>Географический выбор требует сопоставить три обстоятельства: какие дополнительные поставки способен принять рынок, как их динамика связана с действующим экспортом и во сколько обойдется установление новой коммерческой связи. Для интегральных схем при этом различаются прямой торговый партнер, место использования компонента и рынок конечной продукции. Изменение таможенной географии может отражать переход к новому заказчику, другой стадии обработки либо иному маршруту внутри прежней производственной цепочки.</w:t>
+      </w:r>
+    </w:p>
+    <w:p>
+      <w:r>
+        <w:t>Такое разграничение соответствует исследованию ОЭСР Mapping the Semiconductor Value Chain, где проектирование, изготовление пластин, сборка, тестирование и последующее использование рассматриваются как стадии с разным географическим размещением. Для оценки нового направления сведения о прямом получателе необходимо сопоставлять с его ролью в цепочке и областью применения изделия.</w:t>
+      </w:r>
+      <w:r>
+        <w:rPr>
+          <w:rStyle w:val="FootnoteReference"/>
+        </w:rPr>
+        <w:footnoteReference w:id="7"/>
+      </w:r>
+      <w:r/>
+    </w:p>
+    <w:p>
+      <w:r>
+        <w:t>Количественное сравнение выполнено для всех восьми отдельно выделенных направлений основной панели. Для каждой страны все варианты предполагают одинаковую дополнительную стоимость поставок — 1% совокупного экспорта четырех категорий в 2024 году. Это 0,304 млрд долл. для Японии и 1,198 млрд долл. для Кореи. Весь прирост относится к трем категориям вне памяти; их взаимные пропорции сохраняются на уровне 2024 года. Исходные поставки, включая память, остаются неизменными.</w:t>
+      </w:r>
+      <w:r>
+        <w:rPr>
+          <w:rStyle w:val="FootnoteReference"/>
+        </w:rPr>
+        <w:footnoteReference w:id="8"/>
+      </w:r>
+      <w:r/>
+    </w:p>
+    <w:p>
+      <w:r>
+        <w:t>В опорном варианте добавка распределяется по географии каждой товарной категории пропорционально ее исходным поставкам. В альтернативе та же добавка целиком направляется одному партнеру. Общая стоимость и товарные доли двух вариантов совпадают. Поэтому разность стандартных отклонений между ними характеризует только размещение заданного прироста при сохраненной истории колебаний. Она не смешивается со снижением доли памяти вследствие увеличения остальных поставок. В таблице 3.3 также показано, на сколько процентов должен вырасти экспорт трех остальных категорий в выбранное направление.</w:t>
+      </w:r>
+    </w:p>
+    <w:p>
+      <w:r>
+        <w:t>Расчет использует 84 месячных годовых темпа за 2018–2024 годы. Все направления включены по правилу, записанному до получения результатов этого дополнения. Неопределенность оценена по 1 999 парным круговым блочным повторам. Для одновременных интервалов взят 95-й процентиль максимального абсолютного отклонения бутстреп-разностей от исходных оценок внутри восьми направлений каждой страны. Сохранены и обычные поточечные интервалы, но выводы по таблице учитывают совместное рассмотрение всего набора. Интервалы условны на фиксированные веса и наблюдаемую историю.</w:t>
+      </w:r>
+    </w:p>
+    <w:p>
+      <w:pPr>
+        <w:keepNext/>
+        <w:spacing w:line="252" w:lineRule="auto" w:before="100" w:after="100"/>
+        <w:ind w:firstLine="0"/>
+        <w:jc w:val="left"/>
+      </w:pPr>
+      <w:r>
+        <w:rPr>
+          <w:rFonts w:ascii="Times New Roman" w:hAnsi="Times New Roman"/>
+          <w:b w:val="0"/>
+          <w:color w:val="000000"/>
+          <w:sz w:val="22"/>
+        </w:rPr>
+        <w:t>Таблица 3.3 — Сопоставление направлений при одинаковом расширении экспорта</w:t>
+      </w:r>
+    </w:p>
+    <w:tbl>
+      <w:tblPr>
+        <w:tblW w:type="auto" w:w="0"/>
+        <w:jc w:val="center"/>
+        <w:tblLayout w:type="fixed"/>
+        <w:tblLook w:firstColumn="1" w:firstRow="1" w:lastColumn="0" w:lastRow="0" w:noHBand="0" w:noVBand="1" w:val="04A0"/>
+        <w:tblBorders>
+          <w:top w:val="single" w:sz="5" w:color="D9D9D9"/>
+          <w:left w:val="single" w:sz="5" w:color="D9D9D9"/>
+          <w:bottom w:val="single" w:sz="5" w:color="D9D9D9"/>
+          <w:right w:val="single" w:sz="5" w:color="D9D9D9"/>
+          <w:insideH w:val="single" w:sz="5" w:color="D9D9D9"/>
+          <w:insideV w:val="single" w:sz="5" w:color="D9D9D9"/>
+        </w:tblBorders>
+      </w:tblPr>
+      <w:tblGrid>
+        <w:gridCol w:w="1474"/>
+        <w:gridCol w:w="2438"/>
+        <w:gridCol w:w="2438"/>
+        <w:gridCol w:w="1417"/>
+        <w:gridCol w:w="1417"/>
+      </w:tblGrid>
+      <w:tr>
+        <w:trPr>
+          <w:cantSplit/>
+          <w:tblHeader/>
+        </w:trPr>
+        <w:tc>
+          <w:tcPr>
+            <w:tcW w:type="dxa" w:w="1474"/>
+            <w:vAlign w:val="center"/>
+            <w:tcMar>
+              <w:top w:w="65" w:type="dxa"/>
+              <w:bottom w:w="65" w:type="dxa"/>
+              <w:left w:w="75" w:type="dxa"/>
+              <w:right w:w="75" w:type="dxa"/>
+            </w:tcMar>
+            <w:shd w:fill="EDEDED"/>
+          </w:tcPr>
+          <w:p>
+            <w:pPr>
+              <w:keepNext/>
+              <w:keepLines/>
+              <w:spacing w:line="252" w:lineRule="auto" w:before="0" w:after="0"/>
+              <w:ind w:firstLine="0"/>
+              <w:jc w:val="left"/>
+            </w:pPr>
+            <w:r>
+              <w:rPr>
+                <w:rFonts w:ascii="Times New Roman" w:hAnsi="Times New Roman"/>
+                <w:b/>
+                <w:color w:val="000000"/>
+                <w:sz w:val="21"/>
+              </w:rPr>
+              <w:t>Направление</w:t>
+            </w:r>
+          </w:p>
+        </w:tc>
+        <w:tc>
+          <w:tcPr>
+            <w:tcW w:type="dxa" w:w="2438"/>
+            <w:vAlign w:val="center"/>
+            <w:tcMar>
+              <w:top w:w="65" w:type="dxa"/>
+              <w:bottom w:w="65" w:type="dxa"/>
+              <w:left w:w="75" w:type="dxa"/>
+              <w:right w:w="75" w:type="dxa"/>
+            </w:tcMar>
+            <w:shd w:fill="EDEDED"/>
+          </w:tcPr>
+          <w:p>
+            <w:pPr>
+              <w:keepNext/>
+              <w:keepLines/>
+              <w:spacing w:line="252" w:lineRule="auto" w:before="0" w:after="0"/>
+              <w:ind w:firstLine="0"/>
+              <w:jc w:val="center"/>
+            </w:pPr>
+            <w:r>
+              <w:rPr>
+                <w:rFonts w:ascii="Times New Roman" w:hAnsi="Times New Roman"/>
+                <w:b/>
+                <w:color w:val="000000"/>
+                <w:sz w:val="21"/>
+              </w:rPr>
+              <w:t>Япония: разность SD и интервал, п.п.</w:t>
+            </w:r>
+          </w:p>
+        </w:tc>
+        <w:tc>
+          <w:tcPr>
+            <w:tcW w:type="dxa" w:w="2438"/>
+            <w:vAlign w:val="center"/>
+            <w:tcMar>
+              <w:top w:w="65" w:type="dxa"/>
+              <w:bottom w:w="65" w:type="dxa"/>
+              <w:left w:w="75" w:type="dxa"/>
+              <w:right w:w="75" w:type="dxa"/>
+            </w:tcMar>
+            <w:shd w:fill="EDEDED"/>
+          </w:tcPr>
+          <w:p>
+            <w:pPr>
+              <w:keepNext/>
+              <w:keepLines/>
+              <w:spacing w:line="252" w:lineRule="auto" w:before="0" w:after="0"/>
+              <w:ind w:firstLine="0"/>
+              <w:jc w:val="center"/>
+            </w:pPr>
+            <w:r>
+              <w:rPr>
+                <w:rFonts w:ascii="Times New Roman" w:hAnsi="Times New Roman"/>
+                <w:b/>
+                <w:color w:val="000000"/>
+                <w:sz w:val="21"/>
+              </w:rPr>
+              <w:t>Корея: разность SD и интервал, п.п.</w:t>
+            </w:r>
+          </w:p>
+        </w:tc>
+        <w:tc>
+          <w:tcPr>
+            <w:tcW w:type="dxa" w:w="1417"/>
+            <w:vAlign w:val="center"/>
+            <w:tcMar>
+              <w:top w:w="65" w:type="dxa"/>
+              <w:bottom w:w="65" w:type="dxa"/>
+              <w:left w:w="75" w:type="dxa"/>
+              <w:right w:w="75" w:type="dxa"/>
+            </w:tcMar>
+            <w:shd w:fill="EDEDED"/>
+          </w:tcPr>
+          <w:p>
+            <w:pPr>
+              <w:keepNext/>
+              <w:keepLines/>
+              <w:spacing w:line="252" w:lineRule="auto" w:before="0" w:after="0"/>
+              <w:ind w:firstLine="0"/>
+              <w:jc w:val="center"/>
+            </w:pPr>
+            <w:r>
+              <w:rPr>
+                <w:rFonts w:ascii="Times New Roman" w:hAnsi="Times New Roman"/>
+                <w:b/>
+                <w:color w:val="000000"/>
+                <w:sz w:val="21"/>
+              </w:rPr>
+              <w:t>Япония: прирост поставок, %</w:t>
+            </w:r>
+          </w:p>
+        </w:tc>
+        <w:tc>
+          <w:tcPr>
+            <w:tcW w:type="dxa" w:w="1417"/>
+            <w:vAlign w:val="center"/>
+            <w:tcMar>
+              <w:top w:w="65" w:type="dxa"/>
+              <w:bottom w:w="65" w:type="dxa"/>
+              <w:left w:w="75" w:type="dxa"/>
+              <w:right w:w="75" w:type="dxa"/>
+            </w:tcMar>
+            <w:shd w:fill="EDEDED"/>
+          </w:tcPr>
+          <w:p>
+            <w:pPr>
+              <w:keepNext/>
+              <w:keepLines/>
+              <w:spacing w:line="252" w:lineRule="auto" w:before="0" w:after="0"/>
+              <w:ind w:firstLine="0"/>
+              <w:jc w:val="center"/>
+            </w:pPr>
+            <w:r>
+              <w:rPr>
+                <w:rFonts w:ascii="Times New Roman" w:hAnsi="Times New Roman"/>
+                <w:b/>
+                <w:color w:val="000000"/>
+                <w:sz w:val="21"/>
+              </w:rPr>
+              <w:t>Корея: прирост поставок, %</w:t>
             </w:r>
           </w:p>
         </w:tc>
@@ -1405,7 +1739,7 @@
         </w:trPr>
         <w:tc>
           <w:tcPr>
-            <w:tcW w:type="dxa" w:w="2041"/>
+            <w:tcW w:type="dxa" w:w="1474"/>
             <w:vAlign w:val="center"/>
             <w:tcMar>
               <w:top w:w="65" w:type="dxa"/>
@@ -1429,13 +1763,138 @@
                 <w:color w:val="000000"/>
                 <w:sz w:val="21"/>
               </w:rPr>
-              <w:t>Возникает зависимость от первого покупателя</w:t>
+              <w:t>Китай</w:t>
             </w:r>
           </w:p>
         </w:tc>
         <w:tc>
           <w:tcPr>
-            <w:tcW w:type="dxa" w:w="2494"/>
+            <w:tcW w:type="dxa" w:w="2438"/>
+            <w:vAlign w:val="center"/>
+            <w:tcMar>
+              <w:top w:w="65" w:type="dxa"/>
+              <w:bottom w:w="65" w:type="dxa"/>
+              <w:left w:w="75" w:type="dxa"/>
+              <w:right w:w="75" w:type="dxa"/>
+            </w:tcMar>
+          </w:tcPr>
+          <w:p>
+            <w:pPr>
+              <w:keepNext/>
+              <w:keepLines/>
+              <w:spacing w:line="252" w:lineRule="auto" w:before="0" w:after="0"/>
+              <w:ind w:firstLine="0"/>
+              <w:jc w:val="center"/>
+            </w:pPr>
+            <w:r>
+              <w:rPr>
+                <w:rFonts w:ascii="Times New Roman" w:hAnsi="Times New Roman"/>
+                <w:b w:val="0"/>
+                <w:color w:val="000000"/>
+                <w:sz w:val="21"/>
+              </w:rPr>
+              <w:t>−0,001 [−0,101; +0,100]</w:t>
+            </w:r>
+          </w:p>
+        </w:tc>
+        <w:tc>
+          <w:tcPr>
+            <w:tcW w:type="dxa" w:w="2438"/>
+            <w:vAlign w:val="center"/>
+            <w:tcMar>
+              <w:top w:w="65" w:type="dxa"/>
+              <w:bottom w:w="65" w:type="dxa"/>
+              <w:left w:w="75" w:type="dxa"/>
+              <w:right w:w="75" w:type="dxa"/>
+            </w:tcMar>
+          </w:tcPr>
+          <w:p>
+            <w:pPr>
+              <w:keepNext/>
+              <w:keepLines/>
+              <w:spacing w:line="252" w:lineRule="auto" w:before="0" w:after="0"/>
+              <w:ind w:firstLine="0"/>
+              <w:jc w:val="center"/>
+            </w:pPr>
+            <w:r>
+              <w:rPr>
+                <w:rFonts w:ascii="Times New Roman" w:hAnsi="Times New Roman"/>
+                <w:b w:val="0"/>
+                <w:color w:val="000000"/>
+                <w:sz w:val="21"/>
+              </w:rPr>
+              <w:t>+0,009 [−0,161; +0,178]</w:t>
+            </w:r>
+          </w:p>
+        </w:tc>
+        <w:tc>
+          <w:tcPr>
+            <w:tcW w:type="dxa" w:w="1417"/>
+            <w:vAlign w:val="center"/>
+            <w:tcMar>
+              <w:top w:w="65" w:type="dxa"/>
+              <w:bottom w:w="65" w:type="dxa"/>
+              <w:left w:w="75" w:type="dxa"/>
+              <w:right w:w="75" w:type="dxa"/>
+            </w:tcMar>
+          </w:tcPr>
+          <w:p>
+            <w:pPr>
+              <w:keepNext/>
+              <w:keepLines/>
+              <w:spacing w:line="252" w:lineRule="auto" w:before="0" w:after="0"/>
+              <w:ind w:firstLine="0"/>
+              <w:jc w:val="center"/>
+            </w:pPr>
+            <w:r>
+              <w:rPr>
+                <w:rFonts w:ascii="Times New Roman" w:hAnsi="Times New Roman"/>
+                <w:b w:val="0"/>
+                <w:color w:val="000000"/>
+                <w:sz w:val="21"/>
+              </w:rPr>
+              <w:t>13,6</w:t>
+            </w:r>
+          </w:p>
+        </w:tc>
+        <w:tc>
+          <w:tcPr>
+            <w:tcW w:type="dxa" w:w="1417"/>
+            <w:vAlign w:val="center"/>
+            <w:tcMar>
+              <w:top w:w="65" w:type="dxa"/>
+              <w:bottom w:w="65" w:type="dxa"/>
+              <w:left w:w="75" w:type="dxa"/>
+              <w:right w:w="75" w:type="dxa"/>
+            </w:tcMar>
+          </w:tcPr>
+          <w:p>
+            <w:pPr>
+              <w:keepNext/>
+              <w:keepLines/>
+              <w:spacing w:line="252" w:lineRule="auto" w:before="0" w:after="0"/>
+              <w:ind w:firstLine="0"/>
+              <w:jc w:val="center"/>
+            </w:pPr>
+            <w:r>
+              <w:rPr>
+                <w:rFonts w:ascii="Times New Roman" w:hAnsi="Times New Roman"/>
+                <w:b w:val="0"/>
+                <w:color w:val="000000"/>
+                <w:sz w:val="21"/>
+              </w:rPr>
+              <w:t>7,3</w:t>
+            </w:r>
+          </w:p>
+        </w:tc>
+      </w:tr>
+      <w:tr>
+        <w:trPr>
+          <w:cantSplit/>
+        </w:trPr>
+        <w:tc>
+          <w:tcPr>
+            <w:tcW w:type="dxa" w:w="1474"/>
             <w:vAlign w:val="center"/>
             <w:tcMar>
               <w:top w:w="65" w:type="dxa"/>
@@ -1459,13 +1918,138 @@
                 <w:color w:val="000000"/>
                 <w:sz w:val="21"/>
               </w:rPr>
-              <w:t>Проверка адаптации для независимого заказчика</w:t>
+              <w:t>Гонконг</w:t>
             </w:r>
           </w:p>
         </w:tc>
         <w:tc>
           <w:tcPr>
-            <w:tcW w:type="dxa" w:w="2268"/>
+            <w:tcW w:type="dxa" w:w="2438"/>
+            <w:vAlign w:val="center"/>
+            <w:tcMar>
+              <w:top w:w="65" w:type="dxa"/>
+              <w:bottom w:w="65" w:type="dxa"/>
+              <w:left w:w="75" w:type="dxa"/>
+              <w:right w:w="75" w:type="dxa"/>
+            </w:tcMar>
+          </w:tcPr>
+          <w:p>
+            <w:pPr>
+              <w:keepNext/>
+              <w:keepLines/>
+              <w:spacing w:line="252" w:lineRule="auto" w:before="0" w:after="0"/>
+              <w:ind w:firstLine="0"/>
+              <w:jc w:val="center"/>
+            </w:pPr>
+            <w:r>
+              <w:rPr>
+                <w:rFonts w:ascii="Times New Roman" w:hAnsi="Times New Roman"/>
+                <w:b w:val="0"/>
+                <w:color w:val="000000"/>
+                <w:sz w:val="21"/>
+              </w:rPr>
+              <w:t>−0,027 [−0,128; +0,073]</w:t>
+            </w:r>
+          </w:p>
+        </w:tc>
+        <w:tc>
+          <w:tcPr>
+            <w:tcW w:type="dxa" w:w="2438"/>
+            <w:vAlign w:val="center"/>
+            <w:tcMar>
+              <w:top w:w="65" w:type="dxa"/>
+              <w:bottom w:w="65" w:type="dxa"/>
+              <w:left w:w="75" w:type="dxa"/>
+              <w:right w:w="75" w:type="dxa"/>
+            </w:tcMar>
+          </w:tcPr>
+          <w:p>
+            <w:pPr>
+              <w:keepNext/>
+              <w:keepLines/>
+              <w:spacing w:line="252" w:lineRule="auto" w:before="0" w:after="0"/>
+              <w:ind w:firstLine="0"/>
+              <w:jc w:val="center"/>
+            </w:pPr>
+            <w:r>
+              <w:rPr>
+                <w:rFonts w:ascii="Times New Roman" w:hAnsi="Times New Roman"/>
+                <w:b w:val="0"/>
+                <w:color w:val="000000"/>
+                <w:sz w:val="21"/>
+              </w:rPr>
+              <w:t>+0,036 [−0,134; +0,206]</w:t>
+            </w:r>
+          </w:p>
+        </w:tc>
+        <w:tc>
+          <w:tcPr>
+            <w:tcW w:type="dxa" w:w="1417"/>
+            <w:vAlign w:val="center"/>
+            <w:tcMar>
+              <w:top w:w="65" w:type="dxa"/>
+              <w:bottom w:w="65" w:type="dxa"/>
+              <w:left w:w="75" w:type="dxa"/>
+              <w:right w:w="75" w:type="dxa"/>
+            </w:tcMar>
+          </w:tcPr>
+          <w:p>
+            <w:pPr>
+              <w:keepNext/>
+              <w:keepLines/>
+              <w:spacing w:line="252" w:lineRule="auto" w:before="0" w:after="0"/>
+              <w:ind w:firstLine="0"/>
+              <w:jc w:val="center"/>
+            </w:pPr>
+            <w:r>
+              <w:rPr>
+                <w:rFonts w:ascii="Times New Roman" w:hAnsi="Times New Roman"/>
+                <w:b w:val="0"/>
+                <w:color w:val="000000"/>
+                <w:sz w:val="21"/>
+              </w:rPr>
+              <w:t>6,3</w:t>
+            </w:r>
+          </w:p>
+        </w:tc>
+        <w:tc>
+          <w:tcPr>
+            <w:tcW w:type="dxa" w:w="1417"/>
+            <w:vAlign w:val="center"/>
+            <w:tcMar>
+              <w:top w:w="65" w:type="dxa"/>
+              <w:bottom w:w="65" w:type="dxa"/>
+              <w:left w:w="75" w:type="dxa"/>
+              <w:right w:w="75" w:type="dxa"/>
+            </w:tcMar>
+          </w:tcPr>
+          <w:p>
+            <w:pPr>
+              <w:keepNext/>
+              <w:keepLines/>
+              <w:spacing w:line="252" w:lineRule="auto" w:before="0" w:after="0"/>
+              <w:ind w:firstLine="0"/>
+              <w:jc w:val="center"/>
+            </w:pPr>
+            <w:r>
+              <w:rPr>
+                <w:rFonts w:ascii="Times New Roman" w:hAnsi="Times New Roman"/>
+                <w:b w:val="0"/>
+                <w:color w:val="000000"/>
+                <w:sz w:val="21"/>
+              </w:rPr>
+              <w:t>24,1</w:t>
+            </w:r>
+          </w:p>
+        </w:tc>
+      </w:tr>
+      <w:tr>
+        <w:trPr>
+          <w:cantSplit/>
+        </w:trPr>
+        <w:tc>
+          <w:tcPr>
+            <w:tcW w:type="dxa" w:w="1474"/>
             <w:vAlign w:val="center"/>
             <w:tcMar>
               <w:top w:w="65" w:type="dxa"/>
@@ -1489,13 +2073,138 @@
                 <w:color w:val="000000"/>
                 <w:sz w:val="21"/>
               </w:rPr>
-              <w:t>Коммерческая и инженерная команды</w:t>
+              <w:t>Other Asia, nes</w:t>
             </w:r>
           </w:p>
         </w:tc>
         <w:tc>
           <w:tcPr>
-            <w:tcW w:type="dxa" w:w="2381"/>
+            <w:tcW w:type="dxa" w:w="2438"/>
+            <w:vAlign w:val="center"/>
+            <w:tcMar>
+              <w:top w:w="65" w:type="dxa"/>
+              <w:bottom w:w="65" w:type="dxa"/>
+              <w:left w:w="75" w:type="dxa"/>
+              <w:right w:w="75" w:type="dxa"/>
+            </w:tcMar>
+          </w:tcPr>
+          <w:p>
+            <w:pPr>
+              <w:keepNext/>
+              <w:keepLines/>
+              <w:spacing w:line="252" w:lineRule="auto" w:before="0" w:after="0"/>
+              <w:ind w:firstLine="0"/>
+              <w:jc w:val="center"/>
+            </w:pPr>
+            <w:r>
+              <w:rPr>
+                <w:rFonts w:ascii="Times New Roman" w:hAnsi="Times New Roman"/>
+                <w:b w:val="0"/>
+                <w:color w:val="000000"/>
+                <w:sz w:val="21"/>
+              </w:rPr>
+              <w:t>+0,048 [−0,053; +0,148]</w:t>
+            </w:r>
+          </w:p>
+        </w:tc>
+        <w:tc>
+          <w:tcPr>
+            <w:tcW w:type="dxa" w:w="2438"/>
+            <w:vAlign w:val="center"/>
+            <w:tcMar>
+              <w:top w:w="65" w:type="dxa"/>
+              <w:bottom w:w="65" w:type="dxa"/>
+              <w:left w:w="75" w:type="dxa"/>
+              <w:right w:w="75" w:type="dxa"/>
+            </w:tcMar>
+          </w:tcPr>
+          <w:p>
+            <w:pPr>
+              <w:keepNext/>
+              <w:keepLines/>
+              <w:spacing w:line="252" w:lineRule="auto" w:before="0" w:after="0"/>
+              <w:ind w:firstLine="0"/>
+              <w:jc w:val="center"/>
+            </w:pPr>
+            <w:r>
+              <w:rPr>
+                <w:rFonts w:ascii="Times New Roman" w:hAnsi="Times New Roman"/>
+                <w:b w:val="0"/>
+                <w:color w:val="000000"/>
+                <w:sz w:val="21"/>
+              </w:rPr>
+              <w:t>+0,070 [−0,100; +0,240]</w:t>
+            </w:r>
+          </w:p>
+        </w:tc>
+        <w:tc>
+          <w:tcPr>
+            <w:tcW w:type="dxa" w:w="1417"/>
+            <w:vAlign w:val="center"/>
+            <w:tcMar>
+              <w:top w:w="65" w:type="dxa"/>
+              <w:bottom w:w="65" w:type="dxa"/>
+              <w:left w:w="75" w:type="dxa"/>
+              <w:right w:w="75" w:type="dxa"/>
+            </w:tcMar>
+          </w:tcPr>
+          <w:p>
+            <w:pPr>
+              <w:keepNext/>
+              <w:keepLines/>
+              <w:spacing w:line="252" w:lineRule="auto" w:before="0" w:after="0"/>
+              <w:ind w:firstLine="0"/>
+              <w:jc w:val="center"/>
+            </w:pPr>
+            <w:r>
+              <w:rPr>
+                <w:rFonts w:ascii="Times New Roman" w:hAnsi="Times New Roman"/>
+                <w:b w:val="0"/>
+                <w:color w:val="000000"/>
+                <w:sz w:val="21"/>
+              </w:rPr>
+              <w:t>31,7</w:t>
+            </w:r>
+          </w:p>
+        </w:tc>
+        <w:tc>
+          <w:tcPr>
+            <w:tcW w:type="dxa" w:w="1417"/>
+            <w:vAlign w:val="center"/>
+            <w:tcMar>
+              <w:top w:w="65" w:type="dxa"/>
+              <w:bottom w:w="65" w:type="dxa"/>
+              <w:left w:w="75" w:type="dxa"/>
+              <w:right w:w="75" w:type="dxa"/>
+            </w:tcMar>
+          </w:tcPr>
+          <w:p>
+            <w:pPr>
+              <w:keepNext/>
+              <w:keepLines/>
+              <w:spacing w:line="252" w:lineRule="auto" w:before="0" w:after="0"/>
+              <w:ind w:firstLine="0"/>
+              <w:jc w:val="center"/>
+            </w:pPr>
+            <w:r>
+              <w:rPr>
+                <w:rFonts w:ascii="Times New Roman" w:hAnsi="Times New Roman"/>
+                <w:b w:val="0"/>
+                <w:color w:val="000000"/>
+                <w:sz w:val="21"/>
+              </w:rPr>
+              <w:t>19,9</w:t>
+            </w:r>
+          </w:p>
+        </w:tc>
+      </w:tr>
+      <w:tr>
+        <w:trPr>
+          <w:cantSplit/>
+        </w:trPr>
+        <w:tc>
+          <w:tcPr>
+            <w:tcW w:type="dxa" w:w="1474"/>
             <w:vAlign w:val="center"/>
             <w:tcMar>
               <w:top w:w="65" w:type="dxa"/>
@@ -1519,7 +2228,127 @@
                 <w:color w:val="000000"/>
                 <w:sz w:val="21"/>
               </w:rPr>
-              <w:t>Второе подтвержденное применение либо явный учет зависимости</w:t>
+              <w:t>Вьетнам</w:t>
+            </w:r>
+          </w:p>
+        </w:tc>
+        <w:tc>
+          <w:tcPr>
+            <w:tcW w:type="dxa" w:w="2438"/>
+            <w:vAlign w:val="center"/>
+            <w:tcMar>
+              <w:top w:w="65" w:type="dxa"/>
+              <w:bottom w:w="65" w:type="dxa"/>
+              <w:left w:w="75" w:type="dxa"/>
+              <w:right w:w="75" w:type="dxa"/>
+            </w:tcMar>
+          </w:tcPr>
+          <w:p>
+            <w:pPr>
+              <w:keepNext/>
+              <w:keepLines/>
+              <w:spacing w:line="252" w:lineRule="auto" w:before="0" w:after="0"/>
+              <w:ind w:firstLine="0"/>
+              <w:jc w:val="center"/>
+            </w:pPr>
+            <w:r>
+              <w:rPr>
+                <w:rFonts w:ascii="Times New Roman" w:hAnsi="Times New Roman"/>
+                <w:b w:val="0"/>
+                <w:color w:val="000000"/>
+                <w:sz w:val="21"/>
+              </w:rPr>
+              <w:t>+0,017 [−0,084; +0,117]</w:t>
+            </w:r>
+          </w:p>
+        </w:tc>
+        <w:tc>
+          <w:tcPr>
+            <w:tcW w:type="dxa" w:w="2438"/>
+            <w:vAlign w:val="center"/>
+            <w:tcMar>
+              <w:top w:w="65" w:type="dxa"/>
+              <w:bottom w:w="65" w:type="dxa"/>
+              <w:left w:w="75" w:type="dxa"/>
+              <w:right w:w="75" w:type="dxa"/>
+            </w:tcMar>
+          </w:tcPr>
+          <w:p>
+            <w:pPr>
+              <w:keepNext/>
+              <w:keepLines/>
+              <w:spacing w:line="252" w:lineRule="auto" w:before="0" w:after="0"/>
+              <w:ind w:firstLine="0"/>
+              <w:jc w:val="center"/>
+            </w:pPr>
+            <w:r>
+              <w:rPr>
+                <w:rFonts w:ascii="Times New Roman" w:hAnsi="Times New Roman"/>
+                <w:b w:val="0"/>
+                <w:color w:val="000000"/>
+                <w:sz w:val="21"/>
+              </w:rPr>
+              <w:t>−0,024 [−0,194; +0,146]</w:t>
+            </w:r>
+          </w:p>
+        </w:tc>
+        <w:tc>
+          <w:tcPr>
+            <w:tcW w:type="dxa" w:w="1417"/>
+            <w:vAlign w:val="center"/>
+            <w:tcMar>
+              <w:top w:w="65" w:type="dxa"/>
+              <w:bottom w:w="65" w:type="dxa"/>
+              <w:left w:w="75" w:type="dxa"/>
+              <w:right w:w="75" w:type="dxa"/>
+            </w:tcMar>
+          </w:tcPr>
+          <w:p>
+            <w:pPr>
+              <w:keepNext/>
+              <w:keepLines/>
+              <w:spacing w:line="252" w:lineRule="auto" w:before="0" w:after="0"/>
+              <w:ind w:firstLine="0"/>
+              <w:jc w:val="center"/>
+            </w:pPr>
+            <w:r>
+              <w:rPr>
+                <w:rFonts w:ascii="Times New Roman" w:hAnsi="Times New Roman"/>
+                <w:b w:val="0"/>
+                <w:color w:val="000000"/>
+                <w:sz w:val="21"/>
+              </w:rPr>
+              <w:t>14,4</w:t>
+            </w:r>
+          </w:p>
+        </w:tc>
+        <w:tc>
+          <w:tcPr>
+            <w:tcW w:type="dxa" w:w="1417"/>
+            <w:vAlign w:val="center"/>
+            <w:tcMar>
+              <w:top w:w="65" w:type="dxa"/>
+              <w:bottom w:w="65" w:type="dxa"/>
+              <w:left w:w="75" w:type="dxa"/>
+              <w:right w:w="75" w:type="dxa"/>
+            </w:tcMar>
+          </w:tcPr>
+          <w:p>
+            <w:pPr>
+              <w:keepNext/>
+              <w:keepLines/>
+              <w:spacing w:line="252" w:lineRule="auto" w:before="0" w:after="0"/>
+              <w:ind w:firstLine="0"/>
+              <w:jc w:val="center"/>
+            </w:pPr>
+            <w:r>
+              <w:rPr>
+                <w:rFonts w:ascii="Times New Roman" w:hAnsi="Times New Roman"/>
+                <w:b w:val="0"/>
+                <w:color w:val="000000"/>
+                <w:sz w:val="21"/>
+              </w:rPr>
+              <w:t>13,1</w:t>
             </w:r>
           </w:p>
         </w:tc>
@@ -1530,7 +2359,7 @@
         </w:trPr>
         <w:tc>
           <w:tcPr>
-            <w:tcW w:type="dxa" w:w="2041"/>
+            <w:tcW w:type="dxa" w:w="1474"/>
             <w:vAlign w:val="center"/>
             <w:tcMar>
               <w:top w:w="65" w:type="dxa"/>
@@ -1554,13 +2383,138 @@
                 <w:color w:val="000000"/>
                 <w:sz w:val="21"/>
               </w:rPr>
-              <w:t>Масштабирование требует крупных вложений</w:t>
+              <w:t>Сингапур</w:t>
             </w:r>
           </w:p>
         </w:tc>
         <w:tc>
           <w:tcPr>
-            <w:tcW w:type="dxa" w:w="2494"/>
+            <w:tcW w:type="dxa" w:w="2438"/>
+            <w:vAlign w:val="center"/>
+            <w:tcMar>
+              <w:top w:w="65" w:type="dxa"/>
+              <w:bottom w:w="65" w:type="dxa"/>
+              <w:left w:w="75" w:type="dxa"/>
+              <w:right w:w="75" w:type="dxa"/>
+            </w:tcMar>
+          </w:tcPr>
+          <w:p>
+            <w:pPr>
+              <w:keepNext/>
+              <w:keepLines/>
+              <w:spacing w:line="252" w:lineRule="auto" w:before="0" w:after="0"/>
+              <w:ind w:firstLine="0"/>
+              <w:jc w:val="center"/>
+            </w:pPr>
+            <w:r>
+              <w:rPr>
+                <w:rFonts w:ascii="Times New Roman" w:hAnsi="Times New Roman"/>
+                <w:b w:val="0"/>
+                <w:color w:val="000000"/>
+                <w:sz w:val="21"/>
+              </w:rPr>
+              <w:t>−0,037 [−0,138; +0,064]</w:t>
+            </w:r>
+          </w:p>
+        </w:tc>
+        <w:tc>
+          <w:tcPr>
+            <w:tcW w:type="dxa" w:w="2438"/>
+            <w:vAlign w:val="center"/>
+            <w:tcMar>
+              <w:top w:w="65" w:type="dxa"/>
+              <w:bottom w:w="65" w:type="dxa"/>
+              <w:left w:w="75" w:type="dxa"/>
+              <w:right w:w="75" w:type="dxa"/>
+            </w:tcMar>
+          </w:tcPr>
+          <w:p>
+            <w:pPr>
+              <w:keepNext/>
+              <w:keepLines/>
+              <w:spacing w:line="252" w:lineRule="auto" w:before="0" w:after="0"/>
+              <w:ind w:firstLine="0"/>
+              <w:jc w:val="center"/>
+            </w:pPr>
+            <w:r>
+              <w:rPr>
+                <w:rFonts w:ascii="Times New Roman" w:hAnsi="Times New Roman"/>
+                <w:b w:val="0"/>
+                <w:color w:val="000000"/>
+                <w:sz w:val="21"/>
+              </w:rPr>
+              <w:t>−0,020 [−0,189; +0,150]</w:t>
+            </w:r>
+          </w:p>
+        </w:tc>
+        <w:tc>
+          <w:tcPr>
+            <w:tcW w:type="dxa" w:w="1417"/>
+            <w:vAlign w:val="center"/>
+            <w:tcMar>
+              <w:top w:w="65" w:type="dxa"/>
+              <w:bottom w:w="65" w:type="dxa"/>
+              <w:left w:w="75" w:type="dxa"/>
+              <w:right w:w="75" w:type="dxa"/>
+            </w:tcMar>
+          </w:tcPr>
+          <w:p>
+            <w:pPr>
+              <w:keepNext/>
+              <w:keepLines/>
+              <w:spacing w:line="252" w:lineRule="auto" w:before="0" w:after="0"/>
+              <w:ind w:firstLine="0"/>
+              <w:jc w:val="center"/>
+            </w:pPr>
+            <w:r>
+              <w:rPr>
+                <w:rFonts w:ascii="Times New Roman" w:hAnsi="Times New Roman"/>
+                <w:b w:val="0"/>
+                <w:color w:val="000000"/>
+                <w:sz w:val="21"/>
+              </w:rPr>
+              <w:t>79,8</w:t>
+            </w:r>
+          </w:p>
+        </w:tc>
+        <w:tc>
+          <w:tcPr>
+            <w:tcW w:type="dxa" w:w="1417"/>
+            <w:vAlign w:val="center"/>
+            <w:tcMar>
+              <w:top w:w="65" w:type="dxa"/>
+              <w:bottom w:w="65" w:type="dxa"/>
+              <w:left w:w="75" w:type="dxa"/>
+              <w:right w:w="75" w:type="dxa"/>
+            </w:tcMar>
+          </w:tcPr>
+          <w:p>
+            <w:pPr>
+              <w:keepNext/>
+              <w:keepLines/>
+              <w:spacing w:line="252" w:lineRule="auto" w:before="0" w:after="0"/>
+              <w:ind w:firstLine="0"/>
+              <w:jc w:val="center"/>
+            </w:pPr>
+            <w:r>
+              <w:rPr>
+                <w:rFonts w:ascii="Times New Roman" w:hAnsi="Times New Roman"/>
+                <w:b w:val="0"/>
+                <w:color w:val="000000"/>
+                <w:sz w:val="21"/>
+              </w:rPr>
+              <w:t>34,7</w:t>
+            </w:r>
+          </w:p>
+        </w:tc>
+      </w:tr>
+      <w:tr>
+        <w:trPr>
+          <w:cantSplit/>
+        </w:trPr>
+        <w:tc>
+          <w:tcPr>
+            <w:tcW w:type="dxa" w:w="1474"/>
             <w:vAlign w:val="center"/>
             <w:tcMar>
               <w:top w:w="65" w:type="dxa"/>
@@ -1584,13 +2538,138 @@
                 <w:color w:val="000000"/>
                 <w:sz w:val="21"/>
               </w:rPr>
-              <w:t>Поэтапное финансирование после выполнения условий</w:t>
+              <w:t>Филиппины</w:t>
             </w:r>
           </w:p>
         </w:tc>
         <w:tc>
           <w:tcPr>
-            <w:tcW w:type="dxa" w:w="2268"/>
+            <w:tcW w:type="dxa" w:w="2438"/>
+            <w:vAlign w:val="center"/>
+            <w:tcMar>
+              <w:top w:w="65" w:type="dxa"/>
+              <w:bottom w:w="65" w:type="dxa"/>
+              <w:left w:w="75" w:type="dxa"/>
+              <w:right w:w="75" w:type="dxa"/>
+            </w:tcMar>
+          </w:tcPr>
+          <w:p>
+            <w:pPr>
+              <w:keepNext/>
+              <w:keepLines/>
+              <w:spacing w:line="252" w:lineRule="auto" w:before="0" w:after="0"/>
+              <w:ind w:firstLine="0"/>
+              <w:jc w:val="center"/>
+            </w:pPr>
+            <w:r>
+              <w:rPr>
+                <w:rFonts w:ascii="Times New Roman" w:hAnsi="Times New Roman"/>
+                <w:b w:val="0"/>
+                <w:color w:val="000000"/>
+                <w:sz w:val="21"/>
+              </w:rPr>
+              <w:t>0,000 [−0,101; +0,101]</w:t>
+            </w:r>
+          </w:p>
+        </w:tc>
+        <w:tc>
+          <w:tcPr>
+            <w:tcW w:type="dxa" w:w="2438"/>
+            <w:vAlign w:val="center"/>
+            <w:tcMar>
+              <w:top w:w="65" w:type="dxa"/>
+              <w:bottom w:w="65" w:type="dxa"/>
+              <w:left w:w="75" w:type="dxa"/>
+              <w:right w:w="75" w:type="dxa"/>
+            </w:tcMar>
+          </w:tcPr>
+          <w:p>
+            <w:pPr>
+              <w:keepNext/>
+              <w:keepLines/>
+              <w:spacing w:line="252" w:lineRule="auto" w:before="0" w:after="0"/>
+              <w:ind w:firstLine="0"/>
+              <w:jc w:val="center"/>
+            </w:pPr>
+            <w:r>
+              <w:rPr>
+                <w:rFonts w:ascii="Times New Roman" w:hAnsi="Times New Roman"/>
+                <w:b w:val="0"/>
+                <w:color w:val="000000"/>
+                <w:sz w:val="21"/>
+              </w:rPr>
+              <w:t>−0,023 [−0,193; +0,147]</w:t>
+            </w:r>
+          </w:p>
+        </w:tc>
+        <w:tc>
+          <w:tcPr>
+            <w:tcW w:type="dxa" w:w="1417"/>
+            <w:vAlign w:val="center"/>
+            <w:tcMar>
+              <w:top w:w="65" w:type="dxa"/>
+              <w:bottom w:w="65" w:type="dxa"/>
+              <w:left w:w="75" w:type="dxa"/>
+              <w:right w:w="75" w:type="dxa"/>
+            </w:tcMar>
+          </w:tcPr>
+          <w:p>
+            <w:pPr>
+              <w:keepNext/>
+              <w:keepLines/>
+              <w:spacing w:line="252" w:lineRule="auto" w:before="0" w:after="0"/>
+              <w:ind w:firstLine="0"/>
+              <w:jc w:val="center"/>
+            </w:pPr>
+            <w:r>
+              <w:rPr>
+                <w:rFonts w:ascii="Times New Roman" w:hAnsi="Times New Roman"/>
+                <w:b w:val="0"/>
+                <w:color w:val="000000"/>
+                <w:sz w:val="21"/>
+              </w:rPr>
+              <w:t>92,0</w:t>
+            </w:r>
+          </w:p>
+        </w:tc>
+        <w:tc>
+          <w:tcPr>
+            <w:tcW w:type="dxa" w:w="1417"/>
+            <w:vAlign w:val="center"/>
+            <w:tcMar>
+              <w:top w:w="65" w:type="dxa"/>
+              <w:bottom w:w="65" w:type="dxa"/>
+              <w:left w:w="75" w:type="dxa"/>
+              <w:right w:w="75" w:type="dxa"/>
+            </w:tcMar>
+          </w:tcPr>
+          <w:p>
+            <w:pPr>
+              <w:keepNext/>
+              <w:keepLines/>
+              <w:spacing w:line="252" w:lineRule="auto" w:before="0" w:after="0"/>
+              <w:ind w:firstLine="0"/>
+              <w:jc w:val="center"/>
+            </w:pPr>
+            <w:r>
+              <w:rPr>
+                <w:rFonts w:ascii="Times New Roman" w:hAnsi="Times New Roman"/>
+                <w:b w:val="0"/>
+                <w:color w:val="000000"/>
+                <w:sz w:val="21"/>
+              </w:rPr>
+              <w:t>181,6</w:t>
+            </w:r>
+          </w:p>
+        </w:tc>
+      </w:tr>
+      <w:tr>
+        <w:trPr>
+          <w:cantSplit/>
+        </w:trPr>
+        <w:tc>
+          <w:tcPr>
+            <w:tcW w:type="dxa" w:w="1474"/>
             <w:vAlign w:val="center"/>
             <w:tcMar>
               <w:top w:w="65" w:type="dxa"/>
@@ -1614,13 +2693,138 @@
                 <w:color w:val="000000"/>
                 <w:sz w:val="21"/>
               </w:rPr>
-              <w:t>Фирма, инвестор, организация поддержки</w:t>
+              <w:t>США</w:t>
             </w:r>
           </w:p>
         </w:tc>
         <w:tc>
           <w:tcPr>
-            <w:tcW w:type="dxa" w:w="2381"/>
+            <w:tcW w:type="dxa" w:w="2438"/>
+            <w:vAlign w:val="center"/>
+            <w:tcMar>
+              <w:top w:w="65" w:type="dxa"/>
+              <w:bottom w:w="65" w:type="dxa"/>
+              <w:left w:w="75" w:type="dxa"/>
+              <w:right w:w="75" w:type="dxa"/>
+            </w:tcMar>
+          </w:tcPr>
+          <w:p>
+            <w:pPr>
+              <w:keepNext/>
+              <w:keepLines/>
+              <w:spacing w:line="252" w:lineRule="auto" w:before="0" w:after="0"/>
+              <w:ind w:firstLine="0"/>
+              <w:jc w:val="center"/>
+            </w:pPr>
+            <w:r>
+              <w:rPr>
+                <w:rFonts w:ascii="Times New Roman" w:hAnsi="Times New Roman"/>
+                <w:b w:val="0"/>
+                <w:color w:val="000000"/>
+                <w:sz w:val="21"/>
+              </w:rPr>
+              <w:t>−0,033 [−0,134; +0,068]</w:t>
+            </w:r>
+          </w:p>
+        </w:tc>
+        <w:tc>
+          <w:tcPr>
+            <w:tcW w:type="dxa" w:w="2438"/>
+            <w:vAlign w:val="center"/>
+            <w:tcMar>
+              <w:top w:w="65" w:type="dxa"/>
+              <w:bottom w:w="65" w:type="dxa"/>
+              <w:left w:w="75" w:type="dxa"/>
+              <w:right w:w="75" w:type="dxa"/>
+            </w:tcMar>
+          </w:tcPr>
+          <w:p>
+            <w:pPr>
+              <w:keepNext/>
+              <w:keepLines/>
+              <w:spacing w:line="252" w:lineRule="auto" w:before="0" w:after="0"/>
+              <w:ind w:firstLine="0"/>
+              <w:jc w:val="center"/>
+            </w:pPr>
+            <w:r>
+              <w:rPr>
+                <w:rFonts w:ascii="Times New Roman" w:hAnsi="Times New Roman"/>
+                <w:b w:val="0"/>
+                <w:color w:val="000000"/>
+                <w:sz w:val="21"/>
+              </w:rPr>
+              <w:t>+0,120 [−0,050; +0,289]</w:t>
+            </w:r>
+          </w:p>
+        </w:tc>
+        <w:tc>
+          <w:tcPr>
+            <w:tcW w:type="dxa" w:w="1417"/>
+            <w:vAlign w:val="center"/>
+            <w:tcMar>
+              <w:top w:w="65" w:type="dxa"/>
+              <w:bottom w:w="65" w:type="dxa"/>
+              <w:left w:w="75" w:type="dxa"/>
+              <w:right w:w="75" w:type="dxa"/>
+            </w:tcMar>
+          </w:tcPr>
+          <w:p>
+            <w:pPr>
+              <w:keepNext/>
+              <w:keepLines/>
+              <w:spacing w:line="252" w:lineRule="auto" w:before="0" w:after="0"/>
+              <w:ind w:firstLine="0"/>
+              <w:jc w:val="center"/>
+            </w:pPr>
+            <w:r>
+              <w:rPr>
+                <w:rFonts w:ascii="Times New Roman" w:hAnsi="Times New Roman"/>
+                <w:b w:val="0"/>
+                <w:color w:val="000000"/>
+                <w:sz w:val="21"/>
+              </w:rPr>
+              <w:t>40,4</w:t>
+            </w:r>
+          </w:p>
+        </w:tc>
+        <w:tc>
+          <w:tcPr>
+            <w:tcW w:type="dxa" w:w="1417"/>
+            <w:vAlign w:val="center"/>
+            <w:tcMar>
+              <w:top w:w="65" w:type="dxa"/>
+              <w:bottom w:w="65" w:type="dxa"/>
+              <w:left w:w="75" w:type="dxa"/>
+              <w:right w:w="75" w:type="dxa"/>
+            </w:tcMar>
+          </w:tcPr>
+          <w:p>
+            <w:pPr>
+              <w:keepNext/>
+              <w:keepLines/>
+              <w:spacing w:line="252" w:lineRule="auto" w:before="0" w:after="0"/>
+              <w:ind w:firstLine="0"/>
+              <w:jc w:val="center"/>
+            </w:pPr>
+            <w:r>
+              <w:rPr>
+                <w:rFonts w:ascii="Times New Roman" w:hAnsi="Times New Roman"/>
+                <w:b w:val="0"/>
+                <w:color w:val="000000"/>
+                <w:sz w:val="21"/>
+              </w:rPr>
+              <w:t>89,7</w:t>
+            </w:r>
+          </w:p>
+        </w:tc>
+      </w:tr>
+      <w:tr>
+        <w:trPr>
+          <w:cantSplit/>
+        </w:trPr>
+        <w:tc>
+          <w:tcPr>
+            <w:tcW w:type="dxa" w:w="1474"/>
             <w:vAlign w:val="center"/>
             <w:tcMar>
               <w:top w:w="65" w:type="dxa"/>
@@ -1644,12 +2848,148 @@
                 <w:color w:val="000000"/>
                 <w:sz w:val="21"/>
               </w:rPr>
-              <w:t>Подтвержденный заказ и приемлемая экономика серии</w:t>
+              <w:t>Таиланд</w:t>
+            </w:r>
+          </w:p>
+        </w:tc>
+        <w:tc>
+          <w:tcPr>
+            <w:tcW w:type="dxa" w:w="2438"/>
+            <w:vAlign w:val="center"/>
+            <w:tcMar>
+              <w:top w:w="65" w:type="dxa"/>
+              <w:bottom w:w="65" w:type="dxa"/>
+              <w:left w:w="75" w:type="dxa"/>
+              <w:right w:w="75" w:type="dxa"/>
+            </w:tcMar>
+          </w:tcPr>
+          <w:p>
+            <w:pPr>
+              <w:keepNext/>
+              <w:keepLines/>
+              <w:spacing w:line="252" w:lineRule="auto" w:before="0" w:after="0"/>
+              <w:ind w:firstLine="0"/>
+              <w:jc w:val="center"/>
+            </w:pPr>
+            <w:r>
+              <w:rPr>
+                <w:rFonts w:ascii="Times New Roman" w:hAnsi="Times New Roman"/>
+                <w:b w:val="0"/>
+                <w:color w:val="000000"/>
+                <w:sz w:val="21"/>
+              </w:rPr>
+              <w:t>+0,017 [−0,083; +0,118]</w:t>
+            </w:r>
+          </w:p>
+        </w:tc>
+        <w:tc>
+          <w:tcPr>
+            <w:tcW w:type="dxa" w:w="2438"/>
+            <w:vAlign w:val="center"/>
+            <w:tcMar>
+              <w:top w:w="65" w:type="dxa"/>
+              <w:bottom w:w="65" w:type="dxa"/>
+              <w:left w:w="75" w:type="dxa"/>
+              <w:right w:w="75" w:type="dxa"/>
+            </w:tcMar>
+          </w:tcPr>
+          <w:p>
+            <w:pPr>
+              <w:keepNext/>
+              <w:keepLines/>
+              <w:spacing w:line="252" w:lineRule="auto" w:before="0" w:after="0"/>
+              <w:ind w:firstLine="0"/>
+              <w:jc w:val="center"/>
+            </w:pPr>
+            <w:r>
+              <w:rPr>
+                <w:rFonts w:ascii="Times New Roman" w:hAnsi="Times New Roman"/>
+                <w:b w:val="0"/>
+                <w:color w:val="000000"/>
+                <w:sz w:val="21"/>
+              </w:rPr>
+              <w:t>−0,015 [−0,185; +0,155]</w:t>
+            </w:r>
+          </w:p>
+        </w:tc>
+        <w:tc>
+          <w:tcPr>
+            <w:tcW w:type="dxa" w:w="1417"/>
+            <w:vAlign w:val="center"/>
+            <w:tcMar>
+              <w:top w:w="65" w:type="dxa"/>
+              <w:bottom w:w="65" w:type="dxa"/>
+              <w:left w:w="75" w:type="dxa"/>
+              <w:right w:w="75" w:type="dxa"/>
+            </w:tcMar>
+          </w:tcPr>
+          <w:p>
+            <w:pPr>
+              <w:keepNext/>
+              <w:keepLines/>
+              <w:spacing w:line="252" w:lineRule="auto" w:before="0" w:after="0"/>
+              <w:ind w:firstLine="0"/>
+              <w:jc w:val="center"/>
+            </w:pPr>
+            <w:r>
+              <w:rPr>
+                <w:rFonts w:ascii="Times New Roman" w:hAnsi="Times New Roman"/>
+                <w:b w:val="0"/>
+                <w:color w:val="000000"/>
+                <w:sz w:val="21"/>
+              </w:rPr>
+              <w:t>30,9</w:t>
+            </w:r>
+          </w:p>
+        </w:tc>
+        <w:tc>
+          <w:tcPr>
+            <w:tcW w:type="dxa" w:w="1417"/>
+            <w:vAlign w:val="center"/>
+            <w:tcMar>
+              <w:top w:w="65" w:type="dxa"/>
+              <w:bottom w:w="65" w:type="dxa"/>
+              <w:left w:w="75" w:type="dxa"/>
+              <w:right w:w="75" w:type="dxa"/>
+            </w:tcMar>
+          </w:tcPr>
+          <w:p>
+            <w:pPr>
+              <w:keepNext/>
+              <w:keepLines/>
+              <w:spacing w:line="252" w:lineRule="auto" w:before="0" w:after="0"/>
+              <w:ind w:firstLine="0"/>
+              <w:jc w:val="center"/>
+            </w:pPr>
+            <w:r>
+              <w:rPr>
+                <w:rFonts w:ascii="Times New Roman" w:hAnsi="Times New Roman"/>
+                <w:b w:val="0"/>
+                <w:color w:val="000000"/>
+                <w:sz w:val="21"/>
+              </w:rPr>
+              <w:t>235,5</w:t>
             </w:r>
           </w:p>
         </w:tc>
       </w:tr>
     </w:tbl>
+    <w:p>
+      <w:pPr>
+        <w:keepNext/>
+        <w:spacing w:line="240" w:lineRule="auto" w:before="60" w:after="80"/>
+        <w:ind w:firstLine="0"/>
+      </w:pPr>
+      <w:r>
+        <w:rPr>
+          <w:rFonts w:ascii="Times New Roman" w:hAnsi="Times New Roman"/>
+          <w:b w:val="0"/>
+          <w:color w:val="000000"/>
+          <w:sz w:val="20"/>
+        </w:rPr>
+        <w:t>Примечание: разность рассчитана относительно пропорционального размещения той же добавки, а не относительно структуры без прироста. Приведены приближенные 95%-е одновременные интервалы для восьми направлений каждой страны, блок 12 месяцев. Прирост относится к сумме трех категорий вне памяти у выбранного партнера. Other Asia, nes — сохраненное наименование категории UN Comtrade.</w:t>
+      </w:r>
+    </w:p>
     <w:p>
       <w:pPr>
         <w:keepNext w:val="0"/>
@@ -1663,72 +3003,47 @@
           <w:color w:val="000000"/>
           <w:sz w:val="20"/>
         </w:rPr>
-        <w:t>Источник: предложения автора; институциональные примеры — MSS (2025), MOTIE (2025), METI (2024).</w:t>
+        <w:t>Источник: расчеты автора по сохраненной панели UN Comtrade.</w:t>
       </w:r>
     </w:p>
     <w:p>
       <w:r>
-        <w:t>Для каждой меры необходим отдельный расчет ресурсов. На стадии разработки учитываются труд инженеров, лицензии и используемые проектные блоки; при изготовлении образца — производственные услуги, маски, испытания и возможная повторная итерация. Перед серийным выпуском добавляются расходы на квалификацию, обеспечение качества, оборотный капитал и обслуживание покупателей. Часть затрат может быть общей для нескольких проектов. Их распределение должно отражать фактическое использование инфраструктуры, чтобы общие расходы не скрывались за формально низкой стоимостью отдельной разработки.</w:t>
+        <w:t>Для обоих экспортеров одновременные интервалы охватывают ноль для всех направлений. При блоке 6 месяцев этот вывод сохраняется. Следовательно, исследование не выявляет статистически определенного преимущества отдельного размещения перед пропорциональным расширением. При этом точечные оценки показывают, что одно направление может по-разному сочетаться с экспортными портфелями двух стран. Для США разность составляет −0,033 п.п. в Японии и +0,120 п.п. в Корее. Эти оценки относятся к добавлению товарной корзины, заданной отдельно для каждой страны, а не к общей привлекательности американского рынка.</w:t>
       </w:r>
     </w:p>
     <w:p>
       <w:r>
-        <w:t>Состав затрат позволяет определить основания для продолжения проекта. Если образец соответствует заданию, но покупатель не подтверждает потребность, требуется пересмотр коммерческой части. Если спрос подтвержден, но себестоимость превышает допустимый уровень, необходимо изменить конструкцию, условия производства или масштаб. При отсутствии реалистичного пути к приемлемой экономике дальнейшее финансирование не оправдывается одним лишь желанием расширить ассортимент. Такой порядок особенно важен при государственной поддержке, поскольку количество прототипов без коммерческого применения может создавать видимость диверсификации.</w:t>
+        <w:t>Более отчетливо различается масштаб необходимого расширения. В Корее одинаковая добавка требует роста остальных поставок в Китай на 7,3%, во Вьетнам — на 13,1%, в США — на 89,7%, в Таиланд — на 235,5%. Для Японии соответствующие значения равны 13,6; 14,4; 40,4 и 30,9%. Большая начальная база делает процентный прирост меньше, но сама по себе не подтверждает наличие дополнительного спроса. Напротив, малая база означает, что даже умеренное изменение национальной структуры может потребовать многократного расширения отдельного направления.</w:t>
       </w:r>
     </w:p>
     <w:p>
       <w:r>
-        <w:t>Предлагаемые товарные меры имеют общий принцип для обеих стран — развитие дополнительных возможностей получения выручки. Различается основание их приоритетности. В Корее эмпирические результаты поддерживают более пристальное внимание к росту поставок за пределами памяти. В Японии приоритет должен определяться качеством конкретных проектов и их связью с существующими компетенциями. В обоих случаях устойчивость оценивается после проверки спроса и затрат; принадлежность изделия к менее крупной товарной группе сама по себе не служит достаточным преимуществом.</w:t>
-      </w:r>
-    </w:p>
-    <w:p>
-      <w:pPr>
-        <w:pStyle w:val="Heading1"/>
-      </w:pPr>
-      <w:r>
-        <w:t>3.3 Совершенствование географической структуры экспортных поставок</w:t>
+        <w:t>Совокупный прирост по трем категориям способен скрывать еще более сильное изменение одной из них. При принятой общей товарной пропорции прирост корейских поставок прочих интегральных схем HS854239 в США достигает 721,8%, хотя прирост суммы трех категорий равен 89,7%. Поэтому до обсуждения такого расширения необходимо проверить соответствие конкретных изделий спросу и наличие мощности. Все значения по отдельным ячейкам сохранены вместе с расчетом. Использовать только сравнительно благоприятную оценку SD, оставляя без внимания необходимый масштаб продаж, было бы экономически необоснованно.</w:t>
       </w:r>
     </w:p>
     <w:p>
       <w:r>
-        <w:t>Географическая диверсификация должна дополнять развитие товарного предложения. Ее задача состоит в расширении круга покупателей и источников спроса с учетом затрат на обслуживание новых связей. Для интегральных схем особенно важно различать страну, указанную в торговой статистике, место использования компонента и рынок конечной продукции. Перемещение поставки через другой производственный или торговый узел способно изменить таможенную географию без существенного изменения экономического источника выручки.</w:t>
+        <w:t>Практический вывод состоит в установлении очередности проверки. Сначала оцениваются продукт и требуемое расширение относительно существующей базы, затем доступность заказчиков и полная стоимость входа. Совместная динамика поступлений дополняет этот отбор. Для Кореи Китай и Вьетнам дают примеры направлений с меньшим относительным масштабом рассмотренной добавки; США, Филиппины и Таиланд требуют значительно более сильного расширения исходных поставок. Это основание по-разному оценивать необходимый объем новых заказов, без присвоения странам статуса предпочтительного или нежелательного рынка.</w:t>
       </w:r>
     </w:p>
     <w:p>
       <w:r>
-        <w:t>Такое разграничение соответствует устройству международной производственной цепочки. В исследовании ОЭСР Mapping the Semiconductor Value Chain проектирование, изготовление пластин, сборка, тестирование и последующее использование рассматриваются как взаимосвязанные стадии с различным географическим размещением. Для предлагаемого подхода из этого следует необходимость сопоставлять торговое направление с ролью покупателя в цепочке. Сведения о прямом получателе дают отправную точку анализа, но не заменяют информации о применении изделия и зависимости от конечных заказов.</w:t>
-      </w:r>
-      <w:r>
-        <w:rPr>
-          <w:rStyle w:val="FootnoteReference"/>
-        </w:rPr>
-        <w:footnoteReference w:id="6"/>
-      </w:r>
-      <w:r/>
-    </w:p>
-    <w:p>
-      <w:r>
-        <w:t>Например, поставки двум сборочным компаниям в разных странах могут зависеть от продаж одной конечной продуктовой линейки. Формально экспорт распределен между двумя направлениями, однако общая причина изменения заказов сохраняется. Возможна и обратная ситуация: покупатели в одной стране обслуживают разные отрасли и имеют неодинаковую динамику спроса. Эти примеры не являются наблюдаемыми характеристиками отдельных партнеров из исследовательской панели. Они поясняют, какую дополнительную информацию требуется получить прежде, чем делать вывод об экономической самостоятельности нового направления.</w:t>
+        <w:t>Отдельный порядок необходим для ЕС. Европейские страны входят в остаточную группу модели, поэтому расчет не позволяет сопоставить конкретный европейский рынок с США или Китаем. Для проекта в ЕС сначала выделяются страна, изделие и покупатель, после чего проверяются доступные ряды и условия поставки. До такой детализации европейское направление остается кандидатом коммерческого анализа. Остаточная группа и категория Other Asia, nes также не рассматриваются как однородные рынки.</w:t>
       </w:r>
     </w:p>
     <w:p>
       <w:r>
-        <w:t>Поэтому первым шагом предлагается составление карты покупателей. Для каждого существенного контракта фиксируются непосредственный контрагент, принадлежность к корпоративной группе, производственная функция и известная область применения продукции. Если конечный спрос не удается определить, соответствующая доля выручки выделяется отдельно. Неопределенность не должна автоматически трактоваться ни как независимость, ни как полная зависимость покупателей. Для публичной отчетности такие сведения можно агрегировать, сохраняя коммерческую конфиденциальность, а внутри компании использовать более подробный уровень.</w:t>
+        <w:t>На уровне фирмы работу предлагается начинать с карты покупателей. Для существенных контрактов фиксируются контрагент, принадлежность к корпоративной группе, производственная функция и известное конечное применение. Поставки двум сборочным компаниям в разных странах могут зависеть от одной продуктовой линейки, тогда как два заказчика внутри одной страны могут обслуживать разные отрасли. Долю выручки с неизвестным конечным применением следует показывать отдельно. Такой учет делает видимым различие между дополнительным направлением отгрузки и дополнительным источником спроса.</w:t>
       </w:r>
     </w:p>
     <w:p>
       <w:r>
-        <w:t>Второй шаг состоит в оценке доступности нового сочетания продукта и покупателя. Проверяются соответствие характеристик изделия, сроки квалификации, организация сервисной поддержки, условия расчетов и применимые торговые ограничения. Изменение канала поставки само по себе не решает вопрос допустимости сделки. При невозможности выполнить обязательные требования направление исключается из рассматриваемого набора до оценки его исторической волатильности. Такой порядок позволяет избежать ситуации, когда привлекательная статистическая характеристика приписывается коммерчески недоступной поставке.</w:t>
+        <w:t>Для Китая и Гонконга объединение кодов, рассмотренное во второй главе, является проверкой статистической группировки. Оно не восстанавливает конечных покупателей. Аналогично перераспределение отгрузок между азиатскими производственными узлами требует проверки того, меняются ли заказчик и область применения либо только стадия цепочки. Поэтому коммерческое досье проекта должно пояснять, какую именно новую связь создает предполагаемое расширение.</w:t>
       </w:r>
     </w:p>
     <w:p>
       <w:r>
-        <w:t>Третий шаг — анализ экономической самостоятельности спроса. При наличии сопоставимых рядов продаж проверяется совместная динамика с основными действующими покупателями, отдельно по продуктам и областям применения. Короткую историю нового контракта следует дополнять сведениями о деятельности заказчика, но нельзя превращать отсутствие наблюдений в нулевую ковариацию. Если надежной количественной оценки пока нет, возможна ограниченная пилотная поставка с заранее установленным пределом затрат. Ее назначение состоит в получении информации и проверке спроса.</w:t>
-      </w:r>
-    </w:p>
-    <w:p>
-      <w:r>
-        <w:t>Наконец, рассчитывается коммерческая сторона расширения. Ожидаемую дополнительную выручку необходимо сопоставить с производственными расходами, стоимостью входа, испытаний, логистики, сервисной поддержки и финансирования оборотного капитала. Одновременно рассматривается возможное вытеснение действующих заказов при ограниченной мощности. Контракт с новым покупателем не увеличивает совокупный результат фирмы автоматически, если ради него приходится отказаться от более выгодной поставки. Статистическая характеристика портфеля включается в решение вместе с этой оценкой. Предлагаемый порядок представлен на рисунке 3.1.</w:t>
+        <w:t>Далее проверяются технические требования, сроки квалификации, сервис, условия расчетов и допустимость поставки. Ожидаемая выручка сопоставляется с производственными расходами, затратами входа и возможным вытеснением действующих заказов при ограниченной мощности. Если история нового контракта коротка, ее нельзя интерпретировать как отсутствие совместных колебаний. Допустим ограниченный пилот с установленным пределом расходов и датой пересмотра; его результатом должны стать данные о спросе и экономике поставки. Порядок оценки представлен на рисунке 3.1.</w:t>
       </w:r>
     </w:p>
     <w:p>
@@ -1803,7 +3118,7 @@
           <w:color w:val="000000"/>
           <w:sz w:val="20"/>
         </w:rPr>
-        <w:t>Примечание: схема отражает предлагаемый порядок принятия решений; она не является оцененной моделью поведения фирм. При недостатке сведений допускается ограниченный пилот с отдельным бюджетом и сроком пересмотра.</w:t>
+        <w:t>Примечание: схема отражает предлагаемый порядок принятия решений. Предел расходов и срок пересмотра пилота устанавливаются до его начала.</w:t>
       </w:r>
     </w:p>
     <w:p>
@@ -1824,42 +3139,7 @@
     </w:p>
     <w:p>
       <w:r>
-        <w:t>Рассмотренная последовательность не задает универсального списка предпочтительных стран. США, Китай, страны ЕС и азиатские производственные узлы следует включать в анализ как разные совокупности возможных покупателей. В каждом случае решающее значение имеет сочетание продукта, контрагента и области применения. Наличие крупного рынка или известного центра производства не подтверждает, что дополнительная поставка конкретной фирмы будет менее связана с ее прежними продажами. Для такого вывода требуется проверка на уровне заказчиков.</w:t>
-      </w:r>
-    </w:p>
-    <w:p>
-      <w:r>
-        <w:t>При этом основная эмпирическая сетка не позволяет одинаково подробно сравнить все эти направления. США и Китай представлены отдельно, тогда как страны ЕС входят в остаточную группу вместе с другими невыделенными партнерами. Отдельные оценки для европейских стран из основной модели получить нельзя. Перед решением о выходе, например, на конкретный европейский рынок потребуется самостоятельная детализация спроса и статистики. Включение ЕС в обсуждение рекомендаций означает направление дальнейшего коммерческого отбора, а не установленное преимущество по результатам главы 2.</w:t>
-      </w:r>
-    </w:p>
-    <w:p>
-      <w:r>
-        <w:t>Для Китая и Гонконга важна проверка связи прямого назначения с последующим движением продукции. Во второй главе их объединение использовалось как чувствительность к статистической группировке. Такая проверка не восстанавливает конечных покупателей и не позволяет определить, какая доля поставок обслуживает самостоятельный спрос. Поэтому решение о расширении или сокращении конкретных контрактов не может основываться только на результате объединения двух кодов. Требуются сведения о контрагенте и назначении поставляемого изделия.</w:t>
-      </w:r>
-    </w:p>
-    <w:p>
-      <w:r>
-        <w:t>Аналогичный принцип применяется к азиатским направлениям, связанным с международными производственными цепочками. Расширение числа партнеров может создавать полезные коммерческие связи и производственные возможности. Однако для оценки устойчивости нужно установить, означает ли оно появление нового заказчика, изменение стадии обработки либо только перераспределение маршрута. Категория Other Asia, nes и остаточная группа модели также не должны подменять собой перечень однородных рынков. Их агрегированный характер ограничивает допустимую детализацию рекомендаций.</w:t>
-      </w:r>
-    </w:p>
-    <w:p>
-      <w:r>
-        <w:t>Для Кореи приоритет географической работы предлагается связывать с развитием дополнительных применений новых товаров. Если расширение поставок за пределами памяти приводит к тем же конечным заказчикам и одинаковым источникам циклического спроса, часть ожидаемой устойчивости может не реализоваться. Поэтому товарный проект и поиск покупателя следует рассматривать совместно. Это не означает отказ от существующих крупных направлений: надежный действующий контракт может сохранять высокую экономическую ценность. Задача заключается в оценке добавляемой зависимости, а не в механическом уменьшении крупнейшей доли.</w:t>
-      </w:r>
-    </w:p>
-    <w:p>
-      <w:r>
-        <w:t>Для Японии предпочтителен последовательный поиск новых покупателей для продукции, по которой подтверждены технические и коммерческие преимущества фирмы. При небольшом и статистически неопределенном общем результате основной модели крупное перераспределение поставок ради заранее выбранной географической пропорции обосновано слабо. Более проверяемая мера — поддержка испытаний и первых контрактов с независимыми заказчиками, после которых можно оценить повторяемость спроса и стоимость обслуживания. Расширение проекта должно следовать за этой проверкой.</w:t>
-      </w:r>
-    </w:p>
-    <w:p>
-      <w:r>
-        <w:t>Организации поддержки способны содействовать поиску партнеров, доступу к испытательной инфраструктуре и пониманию требований покупателей. Однако число деловых встреч, выставок и подписанных соглашений следует учитывать как промежуточные результаты. Для оценки развития экспортных связей важнее переход к квалификации, оплаченной поставке и повторному заказу. Предлагается различать первоначальный контакт и устойчивую коммерческую связь, а расходы на сопровождение относить к соответствующему этапу. Это позволяет сопоставлять программы по результатам, связанным с поставками.</w:t>
-      </w:r>
-    </w:p>
-    <w:p>
-      <w:r>
-        <w:t>Географическая рекомендация, таким образом, сводится к проверке дополнительного источника спроса, а не к поиску статистически «безопасной» страны. Оценка совместных колебаний помогает выявить зависимости, но не заменяет анализа контракта. В сочетании с продуктовым отбором такой подход позволяет расширять экспортные возможности и одновременно контролировать цену входа, концентрацию покупателей и неопределенность новых связей.</w:t>
+        <w:t>Организации поддержки могут содействовать испытаниям и первым контрактам с независимыми заказчиками. Расходы на выставки и деловые контакты следует связывать с последующими стадиями: квалификацией, оплаченной поставкой и повторным заказом. В Корее поиск покупателей целесообразно объединять с проектами развития продукции вне памяти; в Японии — с расширением применений, для которых подтверждены компетенции и экономика фирмы. Расчет по направлениям задает масштаб такой проверки, а сведения о покупателях позволяют оценить ее коммерческое содержание.</w:t>
       </w:r>
     </w:p>
     <w:p>
@@ -1883,7 +3163,7 @@
         <w:rPr>
           <w:rStyle w:val="FootnoteReference"/>
         </w:rPr>
-        <w:footnoteReference w:id="7"/>
+        <w:footnoteReference w:id="9"/>
       </w:r>
       <w:r/>
     </w:p>
@@ -2255,7 +3535,7 @@
     </w:p>
     <w:p>
       <w:r>
-        <w:t>Для интервалов разности стандартных отклонений используется парная круговая блочная процедура: 1 999 повторов, блок 12 месяцев. Во всех сценариях внутри повтора выбираются одинаковые месяцы, что сохраняет их сопоставимость. В качестве чувствительности используется блок 6 месяцев. В таблицах 3.3 и 3.4 представлены 95%-е процентильные интервалы разности с базой. Они являются поточечными, без поправки на множественные сопоставления, и условны на фиксированные веса и историю. Нулевой сдвиг воспроизводит базу точно, поэтому его разность равна нулю в каждом повторе.</w:t>
+        <w:t>Для интервалов разности стандартных отклонений используется парная круговая блочная процедура: 1 999 повторов, блок 12 месяцев. Во всех сценариях внутри повтора выбираются одинаковые месяцы, что сохраняет их сопоставимость. В качестве чувствительности используется блок 6 месяцев. В таблицах 3.4 и 3.5 представлены 95%-е процентильные интервалы разности с базой. Они являются поточечными, без поправки на множественные сопоставления, и условны на фиксированные веса и историю. Нулевой сдвиг воспроизводит базу точно, поэтому его разность равна нулю в каждом повторе.</w:t>
       </w:r>
     </w:p>
     <w:p>
@@ -2272,7 +3552,7 @@
           <w:color w:val="000000"/>
           <w:sz w:val="22"/>
         </w:rPr>
-        <w:t>Таблица 3.3 — Сценарии изменения доли памяти: Япония</w:t>
+        <w:t>Таблица 3.4 — Сценарии изменения доли памяти: Япония</w:t>
       </w:r>
     </w:p>
     <w:tbl>
@@ -3280,7 +4560,7 @@
           <w:color w:val="000000"/>
           <w:sz w:val="22"/>
         </w:rPr>
-        <w:t>Таблица 3.4 — Сценарии изменения доли памяти: Республика Корея</w:t>
+        <w:t>Таблица 3.5 — Сценарии изменения доли памяти: Республика Корея</w:t>
       </w:r>
     </w:p>
     <w:tbl>
@@ -4255,7 +5535,7 @@
           <w:color w:val="000000"/>
           <w:sz w:val="20"/>
         </w:rPr>
-        <w:t>Примечание: определения и условия совпадают с таблицей 3.3; интервалы относятся к разности с собственной базой страны.</w:t>
+        <w:t>Примечание: определения и условия совпадают с таблицей 3.4; интервалы относятся к разности с собственной базой страны.</w:t>
       </w:r>
     </w:p>
     <w:p>
@@ -4392,7 +5672,7 @@
     </w:p>
     <w:p>
       <w:r>
-        <w:t>Полученные результаты нужно отличать от основной оценки главы 2. Там сравнивались фактически наблюдавшиеся структуры 2017 и 2024 годов с разложением двух измерений. Здесь рассматривается гипотетическое изменение только товарных долей относительно 2024 года. Отрицательный интервал корейского сценария не устраняет неопределенность общего исторического итога −1,27 п.п., интервал которого включает ноль. Это разные сопоставления, отвечающие на разные вопросы.</w:t>
+        <w:t>Полученные результаты нужно отличать от основной оценки главы 2. Там сравнивались фактически наблюдавшиеся структуры 2017 и 2024 годов с разложением двух измерений. Здесь рассматривается гипотетическое изменение только товарных долей относительно 2024 года. Отрицательный интервал корейского сценария не устраняет неопределенность общего исторического итога −1,27 п.п., интервал которого включает ноль.</w:t>
       </w:r>
     </w:p>
     <w:p>
@@ -4713,7 +5993,7 @@
         </m:sSub>
       </m:oMath>
       <w:r>
-        <w:t xml:space="preserve"> представляют годовую номинальную стоимость трех остальных категорий. Соотношение предполагает неизменную стоимость памяти и не описывает производственную реакцию. При неизменных ценах оно может использоваться как ориентир необходимого расширения остальных поставок; без такого условия часть изменения стоимости может быть ценовой. Результаты приведены в таблице 3.5.</w:t>
+        <w:t xml:space="preserve"> представляют годовую номинальную стоимость трех остальных категорий. Соотношение предполагает неизменную стоимость памяти и не описывает производственную реакцию. При неизменных ценах оно может использоваться как ориентир необходимого расширения остальных поставок; без такого условия часть изменения стоимости может быть ценовой. Результаты приведены в таблице 3.6.</w:t>
       </w:r>
     </w:p>
     <w:p>
@@ -4730,7 +6010,7 @@
           <w:color w:val="000000"/>
           <w:sz w:val="22"/>
         </w:rPr>
-        <w:t>Таблица 3.5 — Масштаб расширения остальных поставок при неизменной стоимости памяти</w:t>
+        <w:t>Таблица 3.6 — Масштаб расширения остальных поставок при неизменной стоимости памяти</w:t>
       </w:r>
     </w:p>
     <w:tbl>
@@ -5367,7 +6647,7 @@
     </w:p>
     <w:p>
       <w:r>
-        <w:t>Контроль результатов целесообразно организовать через согласованный набор показателей. Данные о ходе разработки и контрактах можно рассматривать ежеквартально. Структуру поставок и динамику индексов следует обновлять после получения полного и проверенного набора месячных данных, сохраняя годовой цикл итогового сопоставления. Годовые доли снижают зависимость структурной оценки от отдельных месячных партий, хотя сами по себе не устраняют ценовых колебаний. Предлагаемый набор показателей представлен в таблице 3.6.</w:t>
+        <w:t>Контроль результатов целесообразно организовать через согласованный набор показателей. Данные о ходе разработки и контрактах можно рассматривать ежеквартально. Структуру поставок и динамику индексов следует обновлять после получения полного и проверенного набора месячных данных, сохраняя годовой цикл итогового сопоставления. Годовые доли снижают зависимость структурной оценки от отдельных месячных партий, хотя сами по себе не устраняют ценовых колебаний. Предлагаемый набор показателей представлен в таблице 3.7.</w:t>
       </w:r>
     </w:p>
     <w:p>
@@ -5384,7 +6664,7 @@
           <w:color w:val="000000"/>
           <w:sz w:val="22"/>
         </w:rPr>
-        <w:t>Таблица 3.6 — Показатели реализации и критерии пересмотра мер</w:t>
+        <w:t>Таблица 3.7 — Показатели реализации и критерии пересмотра мер</w:t>
       </w:r>
     </w:p>
     <w:tbl>
@@ -5403,10 +6683,10 @@
         </w:tblBorders>
       </w:tblPr>
       <w:tblGrid>
-        <w:gridCol w:w="1474"/>
-        <w:gridCol w:w="2381"/>
+        <w:gridCol w:w="1757"/>
+        <w:gridCol w:w="2268"/>
         <w:gridCol w:w="2324"/>
-        <w:gridCol w:w="3005"/>
+        <w:gridCol w:w="2835"/>
       </w:tblGrid>
       <w:tr>
         <w:trPr>
@@ -5415,7 +6695,7 @@
         </w:trPr>
         <w:tc>
           <w:tcPr>
-            <w:tcW w:type="dxa" w:w="1474"/>
+            <w:tcW w:type="dxa" w:w="1757"/>
             <w:vAlign w:val="center"/>
             <w:tcMar>
               <w:top w:w="65" w:type="dxa"/>
@@ -5446,7 +6726,7 @@
         </w:tc>
         <w:tc>
           <w:tcPr>
-            <w:tcW w:type="dxa" w:w="2381"/>
+            <w:tcW w:type="dxa" w:w="2268"/>
             <w:vAlign w:val="center"/>
             <w:tcMar>
               <w:top w:w="65" w:type="dxa"/>
@@ -5508,7 +6788,7 @@
         </w:tc>
         <w:tc>
           <w:tcPr>
-            <w:tcW w:type="dxa" w:w="3005"/>
+            <w:tcW w:type="dxa" w:w="2835"/>
             <w:vAlign w:val="center"/>
             <w:tcMar>
               <w:top w:w="65" w:type="dxa"/>
@@ -5544,7 +6824,7 @@
         </w:trPr>
         <w:tc>
           <w:tcPr>
-            <w:tcW w:type="dxa" w:w="1474"/>
+            <w:tcW w:type="dxa" w:w="1757"/>
             <w:vAlign w:val="center"/>
             <w:tcMar>
               <w:top w:w="65" w:type="dxa"/>
@@ -5574,7 +6854,7 @@
         </w:tc>
         <w:tc>
           <w:tcPr>
-            <w:tcW w:type="dxa" w:w="2381"/>
+            <w:tcW w:type="dxa" w:w="2268"/>
             <w:vAlign w:val="center"/>
             <w:tcMar>
               <w:top w:w="65" w:type="dxa"/>
@@ -5634,7 +6914,7 @@
         </w:tc>
         <w:tc>
           <w:tcPr>
-            <w:tcW w:type="dxa" w:w="3005"/>
+            <w:tcW w:type="dxa" w:w="2835"/>
             <w:vAlign w:val="center"/>
             <w:tcMar>
               <w:top w:w="65" w:type="dxa"/>
@@ -5669,7 +6949,7 @@
         </w:trPr>
         <w:tc>
           <w:tcPr>
-            <w:tcW w:type="dxa" w:w="1474"/>
+            <w:tcW w:type="dxa" w:w="1757"/>
             <w:vAlign w:val="center"/>
             <w:tcMar>
               <w:top w:w="65" w:type="dxa"/>
@@ -5699,7 +6979,7 @@
         </w:tc>
         <w:tc>
           <w:tcPr>
-            <w:tcW w:type="dxa" w:w="2381"/>
+            <w:tcW w:type="dxa" w:w="2268"/>
             <w:vAlign w:val="center"/>
             <w:tcMar>
               <w:top w:w="65" w:type="dxa"/>
@@ -5759,7 +7039,7 @@
         </w:tc>
         <w:tc>
           <w:tcPr>
-            <w:tcW w:type="dxa" w:w="3005"/>
+            <w:tcW w:type="dxa" w:w="2835"/>
             <w:vAlign w:val="center"/>
             <w:tcMar>
               <w:top w:w="65" w:type="dxa"/>
@@ -5794,7 +7074,7 @@
         </w:trPr>
         <w:tc>
           <w:tcPr>
-            <w:tcW w:type="dxa" w:w="1474"/>
+            <w:tcW w:type="dxa" w:w="1757"/>
             <w:vAlign w:val="center"/>
             <w:tcMar>
               <w:top w:w="65" w:type="dxa"/>
@@ -5824,7 +7104,7 @@
         </w:tc>
         <w:tc>
           <w:tcPr>
-            <w:tcW w:type="dxa" w:w="2381"/>
+            <w:tcW w:type="dxa" w:w="2268"/>
             <w:vAlign w:val="center"/>
             <w:tcMar>
               <w:top w:w="65" w:type="dxa"/>
@@ -5884,7 +7164,7 @@
         </w:tc>
         <w:tc>
           <w:tcPr>
-            <w:tcW w:type="dxa" w:w="3005"/>
+            <w:tcW w:type="dxa" w:w="2835"/>
             <w:vAlign w:val="center"/>
             <w:tcMar>
               <w:top w:w="65" w:type="dxa"/>
@@ -5919,7 +7199,7 @@
         </w:trPr>
         <w:tc>
           <w:tcPr>
-            <w:tcW w:type="dxa" w:w="1474"/>
+            <w:tcW w:type="dxa" w:w="1757"/>
             <w:vAlign w:val="center"/>
             <w:tcMar>
               <w:top w:w="65" w:type="dxa"/>
@@ -5949,7 +7229,7 @@
         </w:tc>
         <w:tc>
           <w:tcPr>
-            <w:tcW w:type="dxa" w:w="2381"/>
+            <w:tcW w:type="dxa" w:w="2268"/>
             <w:vAlign w:val="center"/>
             <w:tcMar>
               <w:top w:w="65" w:type="dxa"/>
@@ -6009,7 +7289,7 @@
         </w:tc>
         <w:tc>
           <w:tcPr>
-            <w:tcW w:type="dxa" w:w="3005"/>
+            <w:tcW w:type="dxa" w:w="2835"/>
             <w:vAlign w:val="center"/>
             <w:tcMar>
               <w:top w:w="65" w:type="dxa"/>
@@ -6044,7 +7324,7 @@
         </w:trPr>
         <w:tc>
           <w:tcPr>
-            <w:tcW w:type="dxa" w:w="1474"/>
+            <w:tcW w:type="dxa" w:w="1757"/>
             <w:vAlign w:val="center"/>
             <w:tcMar>
               <w:top w:w="65" w:type="dxa"/>
@@ -6074,7 +7354,7 @@
         </w:tc>
         <w:tc>
           <w:tcPr>
-            <w:tcW w:type="dxa" w:w="2381"/>
+            <w:tcW w:type="dxa" w:w="2268"/>
             <w:vAlign w:val="center"/>
             <w:tcMar>
               <w:top w:w="65" w:type="dxa"/>
@@ -6134,7 +7414,7 @@
         </w:tc>
         <w:tc>
           <w:tcPr>
-            <w:tcW w:type="dxa" w:w="3005"/>
+            <w:tcW w:type="dxa" w:w="2835"/>
             <w:vAlign w:val="center"/>
             <w:tcMar>
               <w:top w:w="65" w:type="dxa"/>
@@ -6169,7 +7449,7 @@
         </w:trPr>
         <w:tc>
           <w:tcPr>
-            <w:tcW w:type="dxa" w:w="1474"/>
+            <w:tcW w:type="dxa" w:w="1757"/>
             <w:vAlign w:val="center"/>
             <w:tcMar>
               <w:top w:w="65" w:type="dxa"/>
@@ -6199,7 +7479,7 @@
         </w:tc>
         <w:tc>
           <w:tcPr>
-            <w:tcW w:type="dxa" w:w="2381"/>
+            <w:tcW w:type="dxa" w:w="2268"/>
             <w:vAlign w:val="center"/>
             <w:tcMar>
               <w:top w:w="65" w:type="dxa"/>
@@ -6259,7 +7539,7 @@
         </w:tc>
         <w:tc>
           <w:tcPr>
-            <w:tcW w:type="dxa" w:w="3005"/>
+            <w:tcW w:type="dxa" w:w="2835"/>
             <w:vAlign w:val="center"/>
             <w:tcMar>
               <w:top w:w="65" w:type="dxa"/>
@@ -6312,17 +7592,17 @@
     </w:p>
     <w:p>
       <w:r>
-        <w:t>Для оценки программы поддержки необходимо также отличать мониторинг от установления причинного эффекта. Рост экспорта получателей помощи может отражать изменение цен или общий отраслевой подъем. Поэтому до запуска программы целесообразно определить круг потенциально подходящих компаний, критерии отбора и исходные характеристики. Если в дальнейшем доступна сопоставимая группа и обоснованы необходимые предпосылки, можно отдельно оценивать дополнительный результат поддержки. В настоящей работе такой эффект не рассчитывается; представленные показатели обеспечивают наблюдаемость реализации, а не заменяют оценку воздействия.</w:t>
+        <w:t>Для оценки программы поддержки необходимо также отличать мониторинг от установления причинного эффекта. Рост экспорта получателей помощи может отражать изменение цен или общий отраслевой подъем. Поэтому до запуска программы целесообразно определить круг потенциально подходящих компаний, критерии отбора и исходные характеристики. Дополнительный результат поддержки оценивается отдельно при наличии сопоставимой группы и обоснованных предпосылок; представленные здесь показатели предназначены для мониторинга.</w:t>
       </w:r>
     </w:p>
     <w:p>
       <w:r>
-        <w:t>Условия остановки должны задаваться вместе с условиями продолжения. Отсутствие подтвержденного спроса, неустранимое несоответствие требованиям или превышение согласованного предела ресурсов служат основанием для пересмотра проекта. При этом неудачная опытная разработка не обязательно означает неэффективность всей программы: часть ее назначения состоит в раннем выявлении нежизнеспособных решений. Для такого вывода требуется учитывать затраты и результаты всего набора проектов, включая прекращенные, а не только успешные примеры.</w:t>
+        <w:t>Условия остановки должны задаваться вместе с условиями продолжения. Для каждого этапа заранее согласуются предельные расходы и подтверждаемый результат. Пересмотр требуется, если спрос не подтвержден, технические требования невыполнимы или следующий этап не укладывается в согласованный ресурс. При этом неудачная опытная разработка не обязательно означает неэффективность всей программы: часть ее назначения состоит в раннем выявлении нежизнеспособных решений. Для такого вывода требуется учитывать затраты и результаты всего набора проектов, включая прекращенные, а не только успешные примеры.</w:t>
       </w:r>
     </w:p>
     <w:p>
       <w:r>
-        <w:t>Предложенный порядок связывает рекомендации с полученными свидетельствами и пределами их применимости. Для Кореи основное направление состоит в развитии коммерчески состоятельных поставок за пределами памяти при проверке источников спроса. Для Японии — в отборе смежных продуктово-рыночных проектов с подтвержденной экономикой и осторожной оценкой структурных сдвигов. В обеих странах решение о расширении должно опираться на сочетание технической готовности, спроса, затрат и свойств экспортного портфеля. Такой подход позволяет использовать результаты исследования для выбора и последовательной проверки мер, сохраняя экономический смысл диверсификации.</w:t>
+        <w:t>Для Кореи основное направление состоит в развитии коммерчески состоятельных поставок за пределами памяти при проверке источников спроса. Для Японии — в отборе смежных продуктово-рыночных проектов с подтвержденной экономикой и осторожной оценкой структурных сдвигов. В обеих странах решение о расширении должно опираться на сочетание технической готовности, спроса, затрат и свойств экспортного портфеля.</w:t>
       </w:r>
     </w:p>
     <w:p>
@@ -6385,7 +7665,16 @@
         <w:ind w:hanging="397" w:left="397"/>
       </w:pPr>
       <w:r>
-        <w:t>6. United Nations Statistics Division. UN Comtrade Database. Monthly export data, Japan and Republic of Korea, 2017–2024. Выгрузка 16 октября 2026 года.</w:t>
+        <w:t>6. Socionext Inc. Annual Securities Report for the Fiscal Year Ended March 31, 2025. English translation. 2025. Part I, II.3, subsections (2)–(3).</w:t>
+      </w:r>
+    </w:p>
+    <w:p>
+      <w:pPr>
+        <w:spacing w:line="276" w:lineRule="auto" w:after="100"/>
+        <w:ind w:hanging="397" w:left="397"/>
+      </w:pPr>
+      <w:r>
+        <w:t>7. United Nations Statistics Division. UN Comtrade Database. Monthly export data, Japan and Republic of Korea, 2017–2024. Выгрузка 16 октября 2026 года.</w:t>
       </w:r>
     </w:p>
     <w:sectPr>
@@ -6524,11 +7813,43 @@
         <w:footnoteRef/>
       </w:r>
       <w:r>
+        <w:t xml:space="preserve"> Socionext Inc. Annual Securities Report for the Fiscal Year Ended March 31, 2025. English translation, 2025. Part I, II.3, Business Risk Factors, subsections (2)–(3).</w:t>
+      </w:r>
+    </w:p>
+  </w:footnote>
+  <w:footnote w:id="7">
+    <w:p>
+      <w:pPr>
+        <w:pStyle w:val="FootnoteText"/>
+      </w:pPr>
+      <w:r>
+        <w:rPr>
+          <w:rStyle w:val="FootnoteReference"/>
+        </w:rPr>
+        <w:footnoteRef/>
+      </w:r>
+      <w:r>
         <w:t xml:space="preserve"> OECD. Mapping the Semiconductor Value Chain: Working towards Identifying Dependencies and Vulnerabilities. OECD Science, Technology and Industry Policy Papers. 2025. No. 182. DOI: 10.1787/4154cdbf-en. Разделы 2–3.</w:t>
       </w:r>
     </w:p>
   </w:footnote>
-  <w:footnote w:id="7">
+  <w:footnote w:id="8">
+    <w:p>
+      <w:pPr>
+        <w:pStyle w:val="FootnoteText"/>
+      </w:pPr>
+      <w:r>
+        <w:rPr>
+          <w:rStyle w:val="FootnoteReference"/>
+        </w:rPr>
+        <w:footnoteRef/>
+      </w:r>
+      <w:r>
+        <w:t xml:space="preserve"> Расчеты автора по сохраненной панели UN Comtrade. Протокол дополнения зафиксирован 19 октября 2026 года после изучения основной модели, до расчета новых вариантов. Все восемь направлений, обе длины блока и два временных окна сохранены в расчетных материалах. Это условное поисковое сопоставление, не оценка причинного эффекта поддержки.</w:t>
+      </w:r>
+    </w:p>
+  </w:footnote>
+  <w:footnote w:id="9">
     <w:p>
       <w:pPr>
         <w:pStyle w:val="FootnoteText"/>

</xml_diff>